<commit_message>
state the per-type figures as per-class recall
Supervisor feedback on the 7 September milestone asks for precision of
language here. The per-type table now says explicitly that each figure is the
recall for that injected class, aggregated across all four stress runs, and
that these are diagnostic breakdowns of one combined detector rather than
separate detectors or separate success criteria.

Also records that the proposal's criteria of precision 0.80 and recall 0.75
apply to the combined detector and are met on every run, so the fabricated
recall of 0.70 locates the method's weakest point without breaching any
commitment. Same wording applied to section 6.6 of the final report, and the
Word copy rebuilt.
</commit_message>
<xml_diff>
--- a/docs/deliverables/Validation_Report.docx
+++ b/docs/deliverables/Validation_Report.docx
@@ -325,13 +325,31 @@
         <w:pStyle w:val="BodyText"/>
       </w:pPr>
       <w:r>
-        <w:t xml:space="preserve">Detection rates by anomaly type, aggregated across all four stress runs rather</w:t>
-      </w:r>
-      <w:r>
-        <w:t xml:space="preserve"> </w:t>
-      </w:r>
-      <w:r>
-        <w:t xml:space="preserve">than quoted from any single run:</w:t>
+        <w:t xml:space="preserve">Per-class recall by anomaly type. Each figure is the recall for that injected</w:t>
+      </w:r>
+      <w:r>
+        <w:t xml:space="preserve"> </w:t>
+      </w:r>
+      <w:r>
+        <w:t xml:space="preserve">class, that is the proportion of interviews of that type which the detector</w:t>
+      </w:r>
+      <w:r>
+        <w:t xml:space="preserve"> </w:t>
+      </w:r>
+      <w:r>
+        <w:t xml:space="preserve">flagged, aggregated across all four stress runs rather than quoted from any</w:t>
+      </w:r>
+      <w:r>
+        <w:t xml:space="preserve"> </w:t>
+      </w:r>
+      <w:r>
+        <w:t xml:space="preserve">single run. These are diagnostic breakdowns of the combined detector’s recall,</w:t>
+      </w:r>
+      <w:r>
+        <w:t xml:space="preserve"> </w:t>
+      </w:r>
+      <w:r>
+        <w:t xml:space="preserve">not separate detectors and not separate success criteria.</w:t>
       </w:r>
     </w:p>
     <w:tbl>
@@ -379,7 +397,7 @@
               <w:pStyle w:val="Compact"/>
             </w:pPr>
             <w:r>
-              <w:t xml:space="preserve">Rate</w:t>
+              <w:t xml:space="preserve">Per-class recall</w:t>
             </w:r>
           </w:p>
         </w:tc>
@@ -534,6 +552,44 @@
         </w:tc>
       </w:tr>
     </w:tbl>
+    <w:p>
+      <w:pPr>
+        <w:pStyle w:val="BodyText"/>
+      </w:pPr>
+      <w:r>
+        <w:t xml:space="preserve">The proposal’s success criteria, precision at or above 0.80 and recall at or</w:t>
+      </w:r>
+      <w:r>
+        <w:t xml:space="preserve"> </w:t>
+      </w:r>
+      <w:r>
+        <w:t xml:space="preserve">above 0.75, are defined for the combined detector and are met on every run with</w:t>
+      </w:r>
+      <w:r>
+        <w:t xml:space="preserve"> </w:t>
+      </w:r>
+      <w:r>
+        <w:t xml:space="preserve">margin, as the table above shows. No committed target is missed. The per-class</w:t>
+      </w:r>
+      <w:r>
+        <w:t xml:space="preserve"> </w:t>
+      </w:r>
+      <w:r>
+        <w:t xml:space="preserve">figures below that threshold, in particular fabricated recall at 0.70, are</w:t>
+      </w:r>
+      <w:r>
+        <w:t xml:space="preserve"> </w:t>
+      </w:r>
+      <w:r>
+        <w:t xml:space="preserve">reported because they locate where the method is weakest, not because they</w:t>
+      </w:r>
+      <w:r>
+        <w:t xml:space="preserve"> </w:t>
+      </w:r>
+      <w:r>
+        <w:t xml:space="preserve">breach a commitment.</w:t>
+      </w:r>
+    </w:p>
     <w:p>
       <w:pPr>
         <w:pStyle w:val="BodyText"/>
@@ -2358,7 +2414,13 @@
         <w:pStyle w:val="BodyText"/>
       </w:pPr>
       <w:r>
-        <w:t xml:space="preserve">Per-type detection, all four runs:</w:t>
+        <w:t xml:space="preserve">Per-class recall by anomaly type, all four runs. Each cell is the count of that</w:t>
+      </w:r>
+      <w:r>
+        <w:t xml:space="preserve"> </w:t>
+      </w:r>
+      <w:r>
+        <w:t xml:space="preserve">injected class the detector flagged, over the count present:</w:t>
       </w:r>
     </w:p>
     <w:tbl>
@@ -3876,6 +3938,240 @@
       <w:sz w:val="20"/>
       <w:szCs w:val="20"/>
     </w:rPr>
+  </w:style>
+  <w:style w:customStyle="1" w:styleId="SourceCode" w:type="paragraph">
+    <w:name w:val="Source Code"/>
+    <w:basedOn w:val="Normal"/>
+    <w:link w:val="VerbatimChar"/>
+    <w:pPr>
+      <w:wordWrap w:val="off"/>
+    </w:pPr>
+  </w:style>
+  <w:style w:customStyle="1" w:styleId="KeywordTok" w:type="character">
+    <w:name w:val="KeywordTok"/>
+    <w:basedOn w:val="VerbatimChar"/>
+    <w:rPr>
+      <w:b/>
+      <w:color w:val="007020"/>
+    </w:rPr>
+  </w:style>
+  <w:style w:customStyle="1" w:styleId="DataTypeTok" w:type="character">
+    <w:name w:val="DataTypeTok"/>
+    <w:basedOn w:val="VerbatimChar"/>
+    <w:rPr>
+      <w:color w:val="902000"/>
+    </w:rPr>
+  </w:style>
+  <w:style w:customStyle="1" w:styleId="DecValTok" w:type="character">
+    <w:name w:val="DecValTok"/>
+    <w:basedOn w:val="VerbatimChar"/>
+    <w:rPr>
+      <w:color w:val="40a070"/>
+    </w:rPr>
+  </w:style>
+  <w:style w:customStyle="1" w:styleId="BaseNTok" w:type="character">
+    <w:name w:val="BaseNTok"/>
+    <w:basedOn w:val="VerbatimChar"/>
+    <w:rPr>
+      <w:color w:val="40a070"/>
+    </w:rPr>
+  </w:style>
+  <w:style w:customStyle="1" w:styleId="FloatTok" w:type="character">
+    <w:name w:val="FloatTok"/>
+    <w:basedOn w:val="VerbatimChar"/>
+    <w:rPr>
+      <w:color w:val="40a070"/>
+    </w:rPr>
+  </w:style>
+  <w:style w:customStyle="1" w:styleId="ConstantTok" w:type="character">
+    <w:name w:val="ConstantTok"/>
+    <w:basedOn w:val="VerbatimChar"/>
+    <w:rPr>
+      <w:color w:val="880000"/>
+    </w:rPr>
+  </w:style>
+  <w:style w:customStyle="1" w:styleId="CharTok" w:type="character">
+    <w:name w:val="CharTok"/>
+    <w:basedOn w:val="VerbatimChar"/>
+    <w:rPr>
+      <w:color w:val="4070a0"/>
+    </w:rPr>
+  </w:style>
+  <w:style w:customStyle="1" w:styleId="SpecialCharTok" w:type="character">
+    <w:name w:val="SpecialCharTok"/>
+    <w:basedOn w:val="VerbatimChar"/>
+    <w:rPr>
+      <w:color w:val="4070a0"/>
+    </w:rPr>
+  </w:style>
+  <w:style w:customStyle="1" w:styleId="StringTok" w:type="character">
+    <w:name w:val="StringTok"/>
+    <w:basedOn w:val="VerbatimChar"/>
+    <w:rPr>
+      <w:color w:val="4070a0"/>
+    </w:rPr>
+  </w:style>
+  <w:style w:customStyle="1" w:styleId="VerbatimStringTok" w:type="character">
+    <w:name w:val="VerbatimStringTok"/>
+    <w:basedOn w:val="VerbatimChar"/>
+    <w:rPr>
+      <w:color w:val="4070a0"/>
+    </w:rPr>
+  </w:style>
+  <w:style w:customStyle="1" w:styleId="SpecialStringTok" w:type="character">
+    <w:name w:val="SpecialStringTok"/>
+    <w:basedOn w:val="VerbatimChar"/>
+    <w:rPr>
+      <w:color w:val="bb6688"/>
+    </w:rPr>
+  </w:style>
+  <w:style w:customStyle="1" w:styleId="ImportTok" w:type="character">
+    <w:name w:val="ImportTok"/>
+    <w:basedOn w:val="VerbatimChar"/>
+    <w:rPr>
+      <w:b/>
+      <w:color w:val="008000"/>
+    </w:rPr>
+  </w:style>
+  <w:style w:customStyle="1" w:styleId="CommentTok" w:type="character">
+    <w:name w:val="CommentTok"/>
+    <w:basedOn w:val="VerbatimChar"/>
+    <w:rPr>
+      <w:i/>
+      <w:color w:val="60a0b0"/>
+    </w:rPr>
+  </w:style>
+  <w:style w:customStyle="1" w:styleId="DocumentationTok" w:type="character">
+    <w:name w:val="DocumentationTok"/>
+    <w:basedOn w:val="VerbatimChar"/>
+    <w:rPr>
+      <w:i/>
+      <w:color w:val="ba2121"/>
+    </w:rPr>
+  </w:style>
+  <w:style w:customStyle="1" w:styleId="AnnotationTok" w:type="character">
+    <w:name w:val="AnnotationTok"/>
+    <w:basedOn w:val="VerbatimChar"/>
+    <w:rPr>
+      <w:b/>
+      <w:i/>
+      <w:color w:val="60a0b0"/>
+    </w:rPr>
+  </w:style>
+  <w:style w:customStyle="1" w:styleId="CommentVarTok" w:type="character">
+    <w:name w:val="CommentVarTok"/>
+    <w:basedOn w:val="VerbatimChar"/>
+    <w:rPr>
+      <w:b/>
+      <w:i/>
+      <w:color w:val="60a0b0"/>
+    </w:rPr>
+  </w:style>
+  <w:style w:customStyle="1" w:styleId="OtherTok" w:type="character">
+    <w:name w:val="OtherTok"/>
+    <w:basedOn w:val="VerbatimChar"/>
+    <w:rPr>
+      <w:color w:val="007020"/>
+    </w:rPr>
+  </w:style>
+  <w:style w:customStyle="1" w:styleId="FunctionTok" w:type="character">
+    <w:name w:val="FunctionTok"/>
+    <w:basedOn w:val="VerbatimChar"/>
+    <w:rPr>
+      <w:color w:val="06287e"/>
+    </w:rPr>
+  </w:style>
+  <w:style w:customStyle="1" w:styleId="VariableTok" w:type="character">
+    <w:name w:val="VariableTok"/>
+    <w:basedOn w:val="VerbatimChar"/>
+    <w:rPr>
+      <w:color w:val="19177c"/>
+    </w:rPr>
+  </w:style>
+  <w:style w:customStyle="1" w:styleId="ControlFlowTok" w:type="character">
+    <w:name w:val="ControlFlowTok"/>
+    <w:basedOn w:val="VerbatimChar"/>
+    <w:rPr>
+      <w:b/>
+      <w:color w:val="007020"/>
+    </w:rPr>
+  </w:style>
+  <w:style w:customStyle="1" w:styleId="OperatorTok" w:type="character">
+    <w:name w:val="OperatorTok"/>
+    <w:basedOn w:val="VerbatimChar"/>
+    <w:rPr>
+      <w:color w:val="666666"/>
+    </w:rPr>
+  </w:style>
+  <w:style w:customStyle="1" w:styleId="BuiltInTok" w:type="character">
+    <w:name w:val="BuiltInTok"/>
+    <w:basedOn w:val="VerbatimChar"/>
+    <w:rPr>
+      <w:color w:val="008000"/>
+    </w:rPr>
+  </w:style>
+  <w:style w:customStyle="1" w:styleId="ExtensionTok" w:type="character">
+    <w:name w:val="ExtensionTok"/>
+    <w:basedOn w:val="VerbatimChar"/>
+    <w:rPr/>
+  </w:style>
+  <w:style w:customStyle="1" w:styleId="PreprocessorTok" w:type="character">
+    <w:name w:val="PreprocessorTok"/>
+    <w:basedOn w:val="VerbatimChar"/>
+    <w:rPr>
+      <w:color w:val="bc7a00"/>
+    </w:rPr>
+  </w:style>
+  <w:style w:customStyle="1" w:styleId="AttributeTok" w:type="character">
+    <w:name w:val="AttributeTok"/>
+    <w:basedOn w:val="VerbatimChar"/>
+    <w:rPr>
+      <w:color w:val="7d9029"/>
+    </w:rPr>
+  </w:style>
+  <w:style w:customStyle="1" w:styleId="RegionMarkerTok" w:type="character">
+    <w:name w:val="RegionMarkerTok"/>
+    <w:basedOn w:val="VerbatimChar"/>
+    <w:rPr/>
+  </w:style>
+  <w:style w:customStyle="1" w:styleId="InformationTok" w:type="character">
+    <w:name w:val="InformationTok"/>
+    <w:basedOn w:val="VerbatimChar"/>
+    <w:rPr>
+      <w:b/>
+      <w:i/>
+      <w:color w:val="60a0b0"/>
+    </w:rPr>
+  </w:style>
+  <w:style w:customStyle="1" w:styleId="WarningTok" w:type="character">
+    <w:name w:val="WarningTok"/>
+    <w:basedOn w:val="VerbatimChar"/>
+    <w:rPr>
+      <w:b/>
+      <w:i/>
+      <w:color w:val="60a0b0"/>
+    </w:rPr>
+  </w:style>
+  <w:style w:customStyle="1" w:styleId="AlertTok" w:type="character">
+    <w:name w:val="AlertTok"/>
+    <w:basedOn w:val="VerbatimChar"/>
+    <w:rPr>
+      <w:b/>
+      <w:color w:val="ff0000"/>
+    </w:rPr>
+  </w:style>
+  <w:style w:customStyle="1" w:styleId="ErrorTok" w:type="character">
+    <w:name w:val="ErrorTok"/>
+    <w:basedOn w:val="VerbatimChar"/>
+    <w:rPr>
+      <w:b/>
+      <w:color w:val="ff0000"/>
+    </w:rPr>
+  </w:style>
+  <w:style w:customStyle="1" w:styleId="NormalTok" w:type="character">
+    <w:name w:val="NormalTok"/>
+    <w:basedOn w:val="VerbatimChar"/>
+    <w:rPr/>
   </w:style>
   <w:style w:customStyle="1" w:styleId="SourceCode" w:type="paragraph">
     <w:name w:val="Source Code"/>

</xml_diff>

<commit_message>
clarify per-type validation figures
</commit_message>
<xml_diff>
--- a/docs/deliverables/Validation_Report.docx
+++ b/docs/deliverables/Validation_Report.docx
@@ -325,13 +325,31 @@
         <w:pStyle w:val="BodyText"/>
       </w:pPr>
       <w:r>
-        <w:t xml:space="preserve">Detection rates by anomaly type, aggregated across all four stress runs rather</w:t>
-      </w:r>
-      <w:r>
-        <w:t xml:space="preserve"> </w:t>
-      </w:r>
-      <w:r>
-        <w:t xml:space="preserve">than quoted from any single run:</w:t>
+        <w:t xml:space="preserve">Per-class recall by anomaly type. Each figure is the recall for that injected</w:t>
+      </w:r>
+      <w:r>
+        <w:t xml:space="preserve"> </w:t>
+      </w:r>
+      <w:r>
+        <w:t xml:space="preserve">class, that is the proportion of interviews of that type which the detector</w:t>
+      </w:r>
+      <w:r>
+        <w:t xml:space="preserve"> </w:t>
+      </w:r>
+      <w:r>
+        <w:t xml:space="preserve">flagged, aggregated across all four stress runs rather than quoted from any</w:t>
+      </w:r>
+      <w:r>
+        <w:t xml:space="preserve"> </w:t>
+      </w:r>
+      <w:r>
+        <w:t xml:space="preserve">single run. These are diagnostic breakdowns of the combined detector’s recall,</w:t>
+      </w:r>
+      <w:r>
+        <w:t xml:space="preserve"> </w:t>
+      </w:r>
+      <w:r>
+        <w:t xml:space="preserve">not separate detectors and not separate success criteria.</w:t>
       </w:r>
     </w:p>
     <w:tbl>
@@ -379,7 +397,7 @@
               <w:pStyle w:val="Compact"/>
             </w:pPr>
             <w:r>
-              <w:t xml:space="preserve">Rate</w:t>
+              <w:t xml:space="preserve">Per-class recall</w:t>
             </w:r>
           </w:p>
         </w:tc>
@@ -534,6 +552,44 @@
         </w:tc>
       </w:tr>
     </w:tbl>
+    <w:p>
+      <w:pPr>
+        <w:pStyle w:val="BodyText"/>
+      </w:pPr>
+      <w:r>
+        <w:t xml:space="preserve">The proposal’s success criteria, precision at or above 0.80 and recall at or</w:t>
+      </w:r>
+      <w:r>
+        <w:t xml:space="preserve"> </w:t>
+      </w:r>
+      <w:r>
+        <w:t xml:space="preserve">above 0.75, are defined for the combined detector and are met on every run with</w:t>
+      </w:r>
+      <w:r>
+        <w:t xml:space="preserve"> </w:t>
+      </w:r>
+      <w:r>
+        <w:t xml:space="preserve">margin, as the table above shows. No committed target is missed. The per-class</w:t>
+      </w:r>
+      <w:r>
+        <w:t xml:space="preserve"> </w:t>
+      </w:r>
+      <w:r>
+        <w:t xml:space="preserve">figures below that threshold, in particular fabricated recall at 0.70, are</w:t>
+      </w:r>
+      <w:r>
+        <w:t xml:space="preserve"> </w:t>
+      </w:r>
+      <w:r>
+        <w:t xml:space="preserve">reported because they locate where the method is weakest, not because they</w:t>
+      </w:r>
+      <w:r>
+        <w:t xml:space="preserve"> </w:t>
+      </w:r>
+      <w:r>
+        <w:t xml:space="preserve">breach a commitment.</w:t>
+      </w:r>
+    </w:p>
     <w:p>
       <w:pPr>
         <w:pStyle w:val="BodyText"/>
@@ -2358,7 +2414,13 @@
         <w:pStyle w:val="BodyText"/>
       </w:pPr>
       <w:r>
-        <w:t xml:space="preserve">Per-type detection, all four runs:</w:t>
+        <w:t xml:space="preserve">Per-class recall by anomaly type, all four runs. Each cell is the count of that</w:t>
+      </w:r>
+      <w:r>
+        <w:t xml:space="preserve"> </w:t>
+      </w:r>
+      <w:r>
+        <w:t xml:space="preserve">injected class the detector flagged, over the count present:</w:t>
       </w:r>
     </w:p>
     <w:tbl>
@@ -3876,6 +3938,240 @@
       <w:sz w:val="20"/>
       <w:szCs w:val="20"/>
     </w:rPr>
+  </w:style>
+  <w:style w:customStyle="1" w:styleId="SourceCode" w:type="paragraph">
+    <w:name w:val="Source Code"/>
+    <w:basedOn w:val="Normal"/>
+    <w:link w:val="VerbatimChar"/>
+    <w:pPr>
+      <w:wordWrap w:val="off"/>
+    </w:pPr>
+  </w:style>
+  <w:style w:customStyle="1" w:styleId="KeywordTok" w:type="character">
+    <w:name w:val="KeywordTok"/>
+    <w:basedOn w:val="VerbatimChar"/>
+    <w:rPr>
+      <w:b/>
+      <w:color w:val="007020"/>
+    </w:rPr>
+  </w:style>
+  <w:style w:customStyle="1" w:styleId="DataTypeTok" w:type="character">
+    <w:name w:val="DataTypeTok"/>
+    <w:basedOn w:val="VerbatimChar"/>
+    <w:rPr>
+      <w:color w:val="902000"/>
+    </w:rPr>
+  </w:style>
+  <w:style w:customStyle="1" w:styleId="DecValTok" w:type="character">
+    <w:name w:val="DecValTok"/>
+    <w:basedOn w:val="VerbatimChar"/>
+    <w:rPr>
+      <w:color w:val="40a070"/>
+    </w:rPr>
+  </w:style>
+  <w:style w:customStyle="1" w:styleId="BaseNTok" w:type="character">
+    <w:name w:val="BaseNTok"/>
+    <w:basedOn w:val="VerbatimChar"/>
+    <w:rPr>
+      <w:color w:val="40a070"/>
+    </w:rPr>
+  </w:style>
+  <w:style w:customStyle="1" w:styleId="FloatTok" w:type="character">
+    <w:name w:val="FloatTok"/>
+    <w:basedOn w:val="VerbatimChar"/>
+    <w:rPr>
+      <w:color w:val="40a070"/>
+    </w:rPr>
+  </w:style>
+  <w:style w:customStyle="1" w:styleId="ConstantTok" w:type="character">
+    <w:name w:val="ConstantTok"/>
+    <w:basedOn w:val="VerbatimChar"/>
+    <w:rPr>
+      <w:color w:val="880000"/>
+    </w:rPr>
+  </w:style>
+  <w:style w:customStyle="1" w:styleId="CharTok" w:type="character">
+    <w:name w:val="CharTok"/>
+    <w:basedOn w:val="VerbatimChar"/>
+    <w:rPr>
+      <w:color w:val="4070a0"/>
+    </w:rPr>
+  </w:style>
+  <w:style w:customStyle="1" w:styleId="SpecialCharTok" w:type="character">
+    <w:name w:val="SpecialCharTok"/>
+    <w:basedOn w:val="VerbatimChar"/>
+    <w:rPr>
+      <w:color w:val="4070a0"/>
+    </w:rPr>
+  </w:style>
+  <w:style w:customStyle="1" w:styleId="StringTok" w:type="character">
+    <w:name w:val="StringTok"/>
+    <w:basedOn w:val="VerbatimChar"/>
+    <w:rPr>
+      <w:color w:val="4070a0"/>
+    </w:rPr>
+  </w:style>
+  <w:style w:customStyle="1" w:styleId="VerbatimStringTok" w:type="character">
+    <w:name w:val="VerbatimStringTok"/>
+    <w:basedOn w:val="VerbatimChar"/>
+    <w:rPr>
+      <w:color w:val="4070a0"/>
+    </w:rPr>
+  </w:style>
+  <w:style w:customStyle="1" w:styleId="SpecialStringTok" w:type="character">
+    <w:name w:val="SpecialStringTok"/>
+    <w:basedOn w:val="VerbatimChar"/>
+    <w:rPr>
+      <w:color w:val="bb6688"/>
+    </w:rPr>
+  </w:style>
+  <w:style w:customStyle="1" w:styleId="ImportTok" w:type="character">
+    <w:name w:val="ImportTok"/>
+    <w:basedOn w:val="VerbatimChar"/>
+    <w:rPr>
+      <w:b/>
+      <w:color w:val="008000"/>
+    </w:rPr>
+  </w:style>
+  <w:style w:customStyle="1" w:styleId="CommentTok" w:type="character">
+    <w:name w:val="CommentTok"/>
+    <w:basedOn w:val="VerbatimChar"/>
+    <w:rPr>
+      <w:i/>
+      <w:color w:val="60a0b0"/>
+    </w:rPr>
+  </w:style>
+  <w:style w:customStyle="1" w:styleId="DocumentationTok" w:type="character">
+    <w:name w:val="DocumentationTok"/>
+    <w:basedOn w:val="VerbatimChar"/>
+    <w:rPr>
+      <w:i/>
+      <w:color w:val="ba2121"/>
+    </w:rPr>
+  </w:style>
+  <w:style w:customStyle="1" w:styleId="AnnotationTok" w:type="character">
+    <w:name w:val="AnnotationTok"/>
+    <w:basedOn w:val="VerbatimChar"/>
+    <w:rPr>
+      <w:b/>
+      <w:i/>
+      <w:color w:val="60a0b0"/>
+    </w:rPr>
+  </w:style>
+  <w:style w:customStyle="1" w:styleId="CommentVarTok" w:type="character">
+    <w:name w:val="CommentVarTok"/>
+    <w:basedOn w:val="VerbatimChar"/>
+    <w:rPr>
+      <w:b/>
+      <w:i/>
+      <w:color w:val="60a0b0"/>
+    </w:rPr>
+  </w:style>
+  <w:style w:customStyle="1" w:styleId="OtherTok" w:type="character">
+    <w:name w:val="OtherTok"/>
+    <w:basedOn w:val="VerbatimChar"/>
+    <w:rPr>
+      <w:color w:val="007020"/>
+    </w:rPr>
+  </w:style>
+  <w:style w:customStyle="1" w:styleId="FunctionTok" w:type="character">
+    <w:name w:val="FunctionTok"/>
+    <w:basedOn w:val="VerbatimChar"/>
+    <w:rPr>
+      <w:color w:val="06287e"/>
+    </w:rPr>
+  </w:style>
+  <w:style w:customStyle="1" w:styleId="VariableTok" w:type="character">
+    <w:name w:val="VariableTok"/>
+    <w:basedOn w:val="VerbatimChar"/>
+    <w:rPr>
+      <w:color w:val="19177c"/>
+    </w:rPr>
+  </w:style>
+  <w:style w:customStyle="1" w:styleId="ControlFlowTok" w:type="character">
+    <w:name w:val="ControlFlowTok"/>
+    <w:basedOn w:val="VerbatimChar"/>
+    <w:rPr>
+      <w:b/>
+      <w:color w:val="007020"/>
+    </w:rPr>
+  </w:style>
+  <w:style w:customStyle="1" w:styleId="OperatorTok" w:type="character">
+    <w:name w:val="OperatorTok"/>
+    <w:basedOn w:val="VerbatimChar"/>
+    <w:rPr>
+      <w:color w:val="666666"/>
+    </w:rPr>
+  </w:style>
+  <w:style w:customStyle="1" w:styleId="BuiltInTok" w:type="character">
+    <w:name w:val="BuiltInTok"/>
+    <w:basedOn w:val="VerbatimChar"/>
+    <w:rPr>
+      <w:color w:val="008000"/>
+    </w:rPr>
+  </w:style>
+  <w:style w:customStyle="1" w:styleId="ExtensionTok" w:type="character">
+    <w:name w:val="ExtensionTok"/>
+    <w:basedOn w:val="VerbatimChar"/>
+    <w:rPr/>
+  </w:style>
+  <w:style w:customStyle="1" w:styleId="PreprocessorTok" w:type="character">
+    <w:name w:val="PreprocessorTok"/>
+    <w:basedOn w:val="VerbatimChar"/>
+    <w:rPr>
+      <w:color w:val="bc7a00"/>
+    </w:rPr>
+  </w:style>
+  <w:style w:customStyle="1" w:styleId="AttributeTok" w:type="character">
+    <w:name w:val="AttributeTok"/>
+    <w:basedOn w:val="VerbatimChar"/>
+    <w:rPr>
+      <w:color w:val="7d9029"/>
+    </w:rPr>
+  </w:style>
+  <w:style w:customStyle="1" w:styleId="RegionMarkerTok" w:type="character">
+    <w:name w:val="RegionMarkerTok"/>
+    <w:basedOn w:val="VerbatimChar"/>
+    <w:rPr/>
+  </w:style>
+  <w:style w:customStyle="1" w:styleId="InformationTok" w:type="character">
+    <w:name w:val="InformationTok"/>
+    <w:basedOn w:val="VerbatimChar"/>
+    <w:rPr>
+      <w:b/>
+      <w:i/>
+      <w:color w:val="60a0b0"/>
+    </w:rPr>
+  </w:style>
+  <w:style w:customStyle="1" w:styleId="WarningTok" w:type="character">
+    <w:name w:val="WarningTok"/>
+    <w:basedOn w:val="VerbatimChar"/>
+    <w:rPr>
+      <w:b/>
+      <w:i/>
+      <w:color w:val="60a0b0"/>
+    </w:rPr>
+  </w:style>
+  <w:style w:customStyle="1" w:styleId="AlertTok" w:type="character">
+    <w:name w:val="AlertTok"/>
+    <w:basedOn w:val="VerbatimChar"/>
+    <w:rPr>
+      <w:b/>
+      <w:color w:val="ff0000"/>
+    </w:rPr>
+  </w:style>
+  <w:style w:customStyle="1" w:styleId="ErrorTok" w:type="character">
+    <w:name w:val="ErrorTok"/>
+    <w:basedOn w:val="VerbatimChar"/>
+    <w:rPr>
+      <w:b/>
+      <w:color w:val="ff0000"/>
+    </w:rPr>
+  </w:style>
+  <w:style w:customStyle="1" w:styleId="NormalTok" w:type="character">
+    <w:name w:val="NormalTok"/>
+    <w:basedOn w:val="VerbatimChar"/>
+    <w:rPr/>
   </w:style>
   <w:style w:customStyle="1" w:styleId="SourceCode" w:type="paragraph">
     <w:name w:val="Source Code"/>

</xml_diff>

<commit_message>
add component performance breakdown
</commit_message>
<xml_diff>
--- a/docs/deliverables/Validation_Report.docx
+++ b/docs/deliverables/Validation_Report.docx
@@ -28,7 +28,7 @@
         </w:p>
       </w:sdtContent>
     </w:sdt>
-    <w:bookmarkStart w:id="28" w:name="skace-time-data-validation-report"/>
+    <w:bookmarkStart w:id="30" w:name="skace-time-data-validation-report"/>
     <w:p>
       <w:pPr>
         <w:pStyle w:val="Heading1"/>
@@ -3313,13 +3313,13 @@
       </w:r>
     </w:p>
     <w:bookmarkEnd w:id="19"/>
-    <w:bookmarkStart w:id="20" w:name="canonical-validation-set"/>
+    <w:bookmarkStart w:id="21" w:name="contribution-of-each-detection-component"/>
     <w:p>
       <w:pPr>
         <w:pStyle w:val="Heading2"/>
       </w:pPr>
       <w:r>
-        <w:t xml:space="preserve">3. Canonical validation set</w:t>
+        <w:t xml:space="preserve">2.1 Contribution of each detection component</w:t>
       </w:r>
     </w:p>
     <w:p>
@@ -3327,171 +3327,174 @@
         <w:pStyle w:val="FirstParagraph"/>
       </w:pPr>
       <w:r>
-        <w:t xml:space="preserve">The canonical labelled run is the contract test. It uses clean, reproducible</w:t>
-      </w:r>
-      <w:r>
-        <w:t xml:space="preserve"> </w:t>
-      </w:r>
-      <w:r>
-        <w:t xml:space="preserve">profiles and is deliberately easy, so it verifies the intended mapping between</w:t>
-      </w:r>
-      <w:r>
-        <w:t xml:space="preserve"> </w:t>
-      </w:r>
-      <w:r>
-        <w:t xml:space="preserve">profile and category rather than proving field performance.</w:t>
-      </w:r>
-    </w:p>
-    <w:p>
-      <w:pPr>
-        <w:pStyle w:val="SourceCode"/>
-      </w:pPr>
-      <w:r>
-        <w:rPr>
-          <w:rStyle w:val="ExtensionTok"/>
-        </w:rPr>
-        <w:t xml:space="preserve">python</w:t>
-      </w:r>
-      <w:r>
-        <w:rPr>
-          <w:rStyle w:val="NormalTok"/>
-        </w:rPr>
-        <w:t xml:space="preserve"> run_pipeline.py </w:t>
-      </w:r>
-      <w:r>
-        <w:rPr>
-          <w:rStyle w:val="DataTypeTok"/>
-        </w:rPr>
-        <w:t xml:space="preserve">\</w:t>
-      </w:r>
-      <w:r>
-        <w:br/>
-      </w:r>
-      <w:r>
-        <w:rPr>
-          <w:rStyle w:val="NormalTok"/>
-        </w:rPr>
-        <w:t xml:space="preserve">  </w:t>
-      </w:r>
-      <w:r>
-        <w:rPr>
-          <w:rStyle w:val="AttributeTok"/>
-        </w:rPr>
-        <w:t xml:space="preserve">--inputs</w:t>
-      </w:r>
-      <w:r>
-        <w:rPr>
-          <w:rStyle w:val="NormalTok"/>
-        </w:rPr>
-        <w:t xml:space="preserve"> data/workflow_validation/canonical_validation/odk.csv data/workflow_validation/canonical_validation/surveycto.csv </w:t>
-      </w:r>
-      <w:r>
-        <w:rPr>
-          <w:rStyle w:val="DataTypeTok"/>
-        </w:rPr>
-        <w:t xml:space="preserve">\</w:t>
-      </w:r>
-      <w:r>
-        <w:br/>
-      </w:r>
-      <w:r>
-        <w:rPr>
-          <w:rStyle w:val="NormalTok"/>
-        </w:rPr>
-        <w:t xml:space="preserve">  </w:t>
-      </w:r>
-      <w:r>
-        <w:rPr>
-          <w:rStyle w:val="AttributeTok"/>
-        </w:rPr>
-        <w:t xml:space="preserve">--parser</w:t>
-      </w:r>
-      <w:r>
-        <w:rPr>
-          <w:rStyle w:val="NormalTok"/>
-        </w:rPr>
-        <w:t xml:space="preserve"> auto </w:t>
-      </w:r>
-      <w:r>
-        <w:rPr>
-          <w:rStyle w:val="DataTypeTok"/>
-        </w:rPr>
-        <w:t xml:space="preserve">\</w:t>
-      </w:r>
-      <w:r>
-        <w:br/>
-      </w:r>
-      <w:r>
-        <w:rPr>
-          <w:rStyle w:val="NormalTok"/>
-        </w:rPr>
-        <w:t xml:space="preserve">  </w:t>
-      </w:r>
-      <w:r>
-        <w:rPr>
-          <w:rStyle w:val="AttributeTok"/>
-        </w:rPr>
-        <w:t xml:space="preserve">--output-dir</w:t>
-      </w:r>
-      <w:r>
-        <w:rPr>
-          <w:rStyle w:val="NormalTok"/>
-        </w:rPr>
-        <w:t xml:space="preserve"> output </w:t>
-      </w:r>
-      <w:r>
-        <w:rPr>
-          <w:rStyle w:val="DataTypeTok"/>
-        </w:rPr>
-        <w:t xml:space="preserve">\</w:t>
-      </w:r>
-      <w:r>
-        <w:br/>
-      </w:r>
-      <w:r>
-        <w:rPr>
-          <w:rStyle w:val="NormalTok"/>
-        </w:rPr>
-        <w:t xml:space="preserve">  </w:t>
-      </w:r>
-      <w:r>
-        <w:rPr>
-          <w:rStyle w:val="AttributeTok"/>
-        </w:rPr>
-        <w:t xml:space="preserve">--label</w:t>
-      </w:r>
-      <w:r>
-        <w:rPr>
-          <w:rStyle w:val="NormalTok"/>
-        </w:rPr>
-        <w:t xml:space="preserve"> canonical_validation </w:t>
-      </w:r>
-      <w:r>
-        <w:rPr>
-          <w:rStyle w:val="DataTypeTok"/>
-        </w:rPr>
-        <w:t xml:space="preserve">\</w:t>
-      </w:r>
-      <w:r>
-        <w:br/>
-      </w:r>
-      <w:r>
-        <w:rPr>
-          <w:rStyle w:val="NormalTok"/>
-        </w:rPr>
-        <w:t xml:space="preserve">  </w:t>
-      </w:r>
-      <w:r>
-        <w:rPr>
-          <w:rStyle w:val="AttributeTok"/>
-        </w:rPr>
-        <w:t xml:space="preserve">--ground-truth</w:t>
-      </w:r>
-      <w:r>
-        <w:rPr>
-          <w:rStyle w:val="NormalTok"/>
-        </w:rPr>
-        <w:t xml:space="preserve"> data/workflow_validation/canonical_validation/ground_truth_labels.csv</w:t>
+        <w:t xml:space="preserve">The proposal requires separate performance breakdowns for the IQR-based</w:t>
+      </w:r>
+      <w:r>
+        <w:t xml:space="preserve"> </w:t>
+      </w:r>
+      <w:r>
+        <w:t xml:space="preserve">statistical component and the rule-based component, so that the contribution of</w:t>
+      </w:r>
+      <w:r>
+        <w:t xml:space="preserve"> </w:t>
+      </w:r>
+      <w:r>
+        <w:t xml:space="preserve">each can be assessed rather than only their combined effect.</w:t>
+      </w:r>
+    </w:p>
+    <w:p>
+      <w:pPr>
+        <w:pStyle w:val="BodyText"/>
+      </w:pPr>
+      <w:r>
+        <w:t xml:space="preserve">The combined detector flags an interview when</w:t>
+      </w:r>
+      <w:r>
+        <w:t xml:space="preserve"> </w:t>
+      </w:r>
+      <w:r>
+        <w:rPr>
+          <w:rStyle w:val="VerbatimChar"/>
+        </w:rPr>
+        <w:t xml:space="preserve">anomaly_score</w:t>
+      </w:r>
+      <w:r>
+        <w:t xml:space="preserve"> </w:t>
+      </w:r>
+      <w:r>
+        <w:t xml:space="preserve">reaches the</w:t>
+      </w:r>
+      <w:r>
+        <w:t xml:space="preserve"> </w:t>
+      </w:r>
+      <w:r>
+        <w:t xml:space="preserve">behaviour threshold of 2, where</w:t>
+      </w:r>
+      <w:r>
+        <w:t xml:space="preserve"> </w:t>
+      </w:r>
+      <w:r>
+        <w:rPr>
+          <w:rStyle w:val="VerbatimChar"/>
+        </w:rPr>
+        <w:t xml:space="preserve">anomaly_score = min(iqr_flags, 1) + rule_flags</w:t>
+      </w:r>
+      <w:r>
+        <w:t xml:space="preserve">.</w:t>
+      </w:r>
+      <w:r>
+        <w:t xml:space="preserve"> </w:t>
+      </w:r>
+      <w:r>
+        <w:t xml:space="preserve">The IQR contribution is capped at one on purpose, so that several correlated</w:t>
+      </w:r>
+      <w:r>
+        <w:t xml:space="preserve"> </w:t>
+      </w:r>
+      <w:r>
+        <w:t xml:space="preserve">duration, mean and variance outliers arising from the same underlying timing</w:t>
+      </w:r>
+      <w:r>
+        <w:t xml:space="preserve"> </w:t>
+      </w:r>
+      <w:r>
+        <w:t xml:space="preserve">pattern are not counted repeatedly. That cap makes the threshold of 2 unreachable</w:t>
+      </w:r>
+      <w:r>
+        <w:t xml:space="preserve"> </w:t>
+      </w:r>
+      <w:r>
+        <w:t xml:space="preserve">for the IQR component alone, so each component is isolated as follows:</w:t>
+      </w:r>
+    </w:p>
+    <w:p>
+      <w:pPr>
+        <w:pStyle w:val="Compact"/>
+        <w:numPr>
+          <w:ilvl w:val="0"/>
+          <w:numId w:val="1001"/>
+        </w:numPr>
+      </w:pPr>
+      <w:r>
+        <w:rPr>
+          <w:b/>
+          <w:bCs/>
+        </w:rPr>
+        <w:t xml:space="preserve">IQR only:</w:t>
+      </w:r>
+      <w:r>
+        <w:t xml:space="preserve"> </w:t>
+      </w:r>
+      <w:r>
+        <w:t xml:space="preserve">any IQR fence fired,</w:t>
+      </w:r>
+      <w:r>
+        <w:t xml:space="preserve"> </w:t>
+      </w:r>
+      <w:r>
+        <w:rPr>
+          <w:rStyle w:val="VerbatimChar"/>
+        </w:rPr>
+        <w:t xml:space="preserve">iqr_flags &gt;= 1</w:t>
+      </w:r>
+      <w:r>
+        <w:t xml:space="preserve">.</w:t>
+      </w:r>
+    </w:p>
+    <w:p>
+      <w:pPr>
+        <w:pStyle w:val="Compact"/>
+        <w:numPr>
+          <w:ilvl w:val="0"/>
+          <w:numId w:val="1001"/>
+        </w:numPr>
+      </w:pPr>
+      <w:r>
+        <w:rPr>
+          <w:b/>
+          <w:bCs/>
+        </w:rPr>
+        <w:t xml:space="preserve">Rules only:</w:t>
+      </w:r>
+      <w:r>
+        <w:t xml:space="preserve"> </w:t>
+      </w:r>
+      <w:r>
+        <w:rPr>
+          <w:rStyle w:val="VerbatimChar"/>
+        </w:rPr>
+        <w:t xml:space="preserve">rule_flags &gt;= 2</w:t>
+      </w:r>
+      <w:r>
+        <w:t xml:space="preserve">, the same threshold the combined detector</w:t>
+      </w:r>
+      <w:r>
+        <w:t xml:space="preserve"> </w:t>
+      </w:r>
+      <w:r>
+        <w:t xml:space="preserve">applies, with the IQR contribution removed.</w:t>
+      </w:r>
+    </w:p>
+    <w:p>
+      <w:pPr>
+        <w:pStyle w:val="Compact"/>
+        <w:numPr>
+          <w:ilvl w:val="0"/>
+          <w:numId w:val="1001"/>
+        </w:numPr>
+      </w:pPr>
+      <w:r>
+        <w:rPr>
+          <w:b/>
+          <w:bCs/>
+        </w:rPr>
+        <w:t xml:space="preserve">Combined:</w:t>
+      </w:r>
+      <w:r>
+        <w:t xml:space="preserve"> </w:t>
+      </w:r>
+      <w:r>
+        <w:t xml:space="preserve">the shipped detector, unchanged.</w:t>
       </w:r>
     </w:p>
     <w:p>
@@ -3499,126 +3502,7 @@
         <w:pStyle w:val="FirstParagraph"/>
       </w:pPr>
       <w:r>
-        <w:t xml:space="preserve">Verified result: precision 1.0000, recall 1.0000, F1 1.0000.</w:t>
-      </w:r>
-    </w:p>
-    <w:p>
-      <w:pPr>
-        <w:pStyle w:val="BodyText"/>
-      </w:pPr>
-      <w:r>
-        <w:t xml:space="preserve">The run writes</w:t>
-      </w:r>
-      <w:r>
-        <w:t xml:space="preserve"> </w:t>
-      </w:r>
-      <w:r>
-        <w:rPr>
-          <w:rStyle w:val="VerbatimChar"/>
-        </w:rPr>
-        <w:t xml:space="preserve">output/question_features_canonical_validation.csv</w:t>
-      </w:r>
-      <w:r>
-        <w:t xml:space="preserve">,</w:t>
-      </w:r>
-      <w:r>
-        <w:t xml:space="preserve"> </w:t>
-      </w:r>
-      <w:r>
-        <w:rPr>
-          <w:rStyle w:val="VerbatimChar"/>
-        </w:rPr>
-        <w:t xml:space="preserve">output/section_features_canonical_validation.csv</w:t>
-      </w:r>
-      <w:r>
-        <w:t xml:space="preserve">,</w:t>
-      </w:r>
-      <w:r>
-        <w:t xml:space="preserve"> </w:t>
-      </w:r>
-      <w:r>
-        <w:rPr>
-          <w:rStyle w:val="VerbatimChar"/>
-        </w:rPr>
-        <w:t xml:space="preserve">output/feature_dataset_canonical_validation.csv</w:t>
-      </w:r>
-      <w:r>
-        <w:t xml:space="preserve">,</w:t>
-      </w:r>
-      <w:r>
-        <w:t xml:space="preserve"> </w:t>
-      </w:r>
-      <w:r>
-        <w:rPr>
-          <w:rStyle w:val="VerbatimChar"/>
-        </w:rPr>
-        <w:t xml:space="preserve">output/anomaly_report_canonical_validation.csv</w:t>
-      </w:r>
-      <w:r>
-        <w:t xml:space="preserve">,</w:t>
-      </w:r>
-      <w:r>
-        <w:t xml:space="preserve"> </w:t>
-      </w:r>
-      <w:r>
-        <w:rPr>
-          <w:rStyle w:val="VerbatimChar"/>
-        </w:rPr>
-        <w:t xml:space="preserve">output/pipeline_output_canonical_validation.csv</w:t>
-      </w:r>
-      <w:r>
-        <w:t xml:space="preserve">,</w:t>
-      </w:r>
-      <w:r>
-        <w:t xml:space="preserve"> </w:t>
-      </w:r>
-      <w:r>
-        <w:rPr>
-          <w:rStyle w:val="VerbatimChar"/>
-        </w:rPr>
-        <w:t xml:space="preserve">output/predictions_canonical_validation.csv</w:t>
-      </w:r>
-      <w:r>
-        <w:t xml:space="preserve"> </w:t>
-      </w:r>
-      <w:r>
-        <w:t xml:space="preserve">and</w:t>
-      </w:r>
-      <w:r>
-        <w:t xml:space="preserve"> </w:t>
-      </w:r>
-      <w:r>
-        <w:rPr>
-          <w:rStyle w:val="VerbatimChar"/>
-        </w:rPr>
-        <w:t xml:space="preserve">output/metrics_canonical_validation.{csv,json,md}</w:t>
-      </w:r>
-      <w:r>
-        <w:t xml:space="preserve">.</w:t>
-      </w:r>
-    </w:p>
-    <w:bookmarkEnd w:id="20"/>
-    <w:bookmarkStart w:id="21" w:name="class-imbalance-sweep"/>
-    <w:p>
-      <w:pPr>
-        <w:pStyle w:val="Heading2"/>
-      </w:pPr>
-      <w:r>
-        <w:t xml:space="preserve">4. Class imbalance sweep</w:t>
-      </w:r>
-    </w:p>
-    <w:p>
-      <w:pPr>
-        <w:pStyle w:val="FirstParagraph"/>
-      </w:pPr>
-      <w:r>
-        <w:t xml:space="preserve">Held-out seed 7, canonical difficulty, SurveyCTO, 500 interviews, with the</w:t>
-      </w:r>
-      <w:r>
-        <w:t xml:space="preserve"> </w:t>
-      </w:r>
-      <w:r>
-        <w:t xml:space="preserve">proportion of anomalies varied.</w:t>
+        <w:t xml:space="preserve">Aggregated over all ten runs of the robustness round:</w:t>
       </w:r>
     </w:p>
     <w:tbl>
@@ -3628,10 +3512,13 @@
         <w:tblLook w:firstRow="1" w:lastRow="0" w:firstColumn="0" w:lastColumn="0" w:noHBand="0" w:noVBand="0" w:val="0020"/>
       </w:tblPr>
       <w:tblGrid>
-        <w:gridCol w:w="1980"/>
-        <w:gridCol w:w="1980"/>
-        <w:gridCol w:w="1980"/>
-        <w:gridCol w:w="1980"/>
+        <w:gridCol w:w="1131"/>
+        <w:gridCol w:w="1131"/>
+        <w:gridCol w:w="1131"/>
+        <w:gridCol w:w="1131"/>
+        <w:gridCol w:w="1131"/>
+        <w:gridCol w:w="1131"/>
+        <w:gridCol w:w="1131"/>
       </w:tblGrid>
       <w:tr>
         <w:trPr>
@@ -3644,7 +3531,7 @@
               <w:pStyle w:val="Compact"/>
             </w:pPr>
             <w:r>
-              <w:t xml:space="preserve">Anomaly prevalence</w:t>
+              <w:t xml:space="preserve">Component</w:t>
             </w:r>
           </w:p>
         </w:tc>
@@ -3678,6 +3565,39 @@
             </w:pPr>
             <w:r>
               <w:t xml:space="preserve">F1</w:t>
+            </w:r>
+          </w:p>
+        </w:tc>
+        <w:tc>
+          <w:tcPr/>
+          <w:p>
+            <w:pPr>
+              <w:pStyle w:val="Compact"/>
+            </w:pPr>
+            <w:r>
+              <w:t xml:space="preserve">TP</w:t>
+            </w:r>
+          </w:p>
+        </w:tc>
+        <w:tc>
+          <w:tcPr/>
+          <w:p>
+            <w:pPr>
+              <w:pStyle w:val="Compact"/>
+            </w:pPr>
+            <w:r>
+              <w:t xml:space="preserve">FP</w:t>
+            </w:r>
+          </w:p>
+        </w:tc>
+        <w:tc>
+          <w:tcPr/>
+          <w:p>
+            <w:pPr>
+              <w:pStyle w:val="Compact"/>
+            </w:pPr>
+            <w:r>
+              <w:t xml:space="preserve">FN</w:t>
             </w:r>
           </w:p>
         </w:tc>
@@ -3690,40 +3610,73 @@
               <w:pStyle w:val="Compact"/>
             </w:pPr>
             <w:r>
-              <w:t xml:space="preserve">5 percent</w:t>
-            </w:r>
-          </w:p>
-        </w:tc>
-        <w:tc>
-          <w:tcPr/>
-          <w:p>
-            <w:pPr>
-              <w:pStyle w:val="Compact"/>
-            </w:pPr>
-            <w:r>
-              <w:t xml:space="preserve">0.9615</w:t>
-            </w:r>
-          </w:p>
-        </w:tc>
-        <w:tc>
-          <w:tcPr/>
-          <w:p>
-            <w:pPr>
-              <w:pStyle w:val="Compact"/>
-            </w:pPr>
-            <w:r>
-              <w:t xml:space="preserve">1.0000</w:t>
-            </w:r>
-          </w:p>
-        </w:tc>
-        <w:tc>
-          <w:tcPr/>
-          <w:p>
-            <w:pPr>
-              <w:pStyle w:val="Compact"/>
-            </w:pPr>
-            <w:r>
-              <w:t xml:space="preserve">0.9804</w:t>
+              <w:t xml:space="preserve">Combined</w:t>
+            </w:r>
+          </w:p>
+        </w:tc>
+        <w:tc>
+          <w:tcPr/>
+          <w:p>
+            <w:pPr>
+              <w:pStyle w:val="Compact"/>
+            </w:pPr>
+            <w:r>
+              <w:t xml:space="preserve">0.9920</w:t>
+            </w:r>
+          </w:p>
+        </w:tc>
+        <w:tc>
+          <w:tcPr/>
+          <w:p>
+            <w:pPr>
+              <w:pStyle w:val="Compact"/>
+            </w:pPr>
+            <w:r>
+              <w:t xml:space="preserve">0.9416</w:t>
+            </w:r>
+          </w:p>
+        </w:tc>
+        <w:tc>
+          <w:tcPr/>
+          <w:p>
+            <w:pPr>
+              <w:pStyle w:val="Compact"/>
+            </w:pPr>
+            <w:r>
+              <w:t xml:space="preserve">0.9662</w:t>
+            </w:r>
+          </w:p>
+        </w:tc>
+        <w:tc>
+          <w:tcPr/>
+          <w:p>
+            <w:pPr>
+              <w:pStyle w:val="Compact"/>
+            </w:pPr>
+            <w:r>
+              <w:t xml:space="preserve">871</w:t>
+            </w:r>
+          </w:p>
+        </w:tc>
+        <w:tc>
+          <w:tcPr/>
+          <w:p>
+            <w:pPr>
+              <w:pStyle w:val="Compact"/>
+            </w:pPr>
+            <w:r>
+              <w:t xml:space="preserve">7</w:t>
+            </w:r>
+          </w:p>
+        </w:tc>
+        <w:tc>
+          <w:tcPr/>
+          <w:p>
+            <w:pPr>
+              <w:pStyle w:val="Compact"/>
+            </w:pPr>
+            <w:r>
+              <w:t xml:space="preserve">54</w:t>
             </w:r>
           </w:p>
         </w:tc>
@@ -3736,40 +3689,73 @@
               <w:pStyle w:val="Compact"/>
             </w:pPr>
             <w:r>
-              <w:t xml:space="preserve">10 percent</w:t>
-            </w:r>
-          </w:p>
-        </w:tc>
-        <w:tc>
-          <w:tcPr/>
-          <w:p>
-            <w:pPr>
-              <w:pStyle w:val="Compact"/>
-            </w:pPr>
-            <w:r>
-              <w:t xml:space="preserve">1.0000</w:t>
-            </w:r>
-          </w:p>
-        </w:tc>
-        <w:tc>
-          <w:tcPr/>
-          <w:p>
-            <w:pPr>
-              <w:pStyle w:val="Compact"/>
-            </w:pPr>
-            <w:r>
-              <w:t xml:space="preserve">1.0000</w:t>
-            </w:r>
-          </w:p>
-        </w:tc>
-        <w:tc>
-          <w:tcPr/>
-          <w:p>
-            <w:pPr>
-              <w:pStyle w:val="Compact"/>
-            </w:pPr>
-            <w:r>
-              <w:t xml:space="preserve">1.0000</w:t>
+              <w:t xml:space="preserve">Rules only</w:t>
+            </w:r>
+          </w:p>
+        </w:tc>
+        <w:tc>
+          <w:tcPr/>
+          <w:p>
+            <w:pPr>
+              <w:pStyle w:val="Compact"/>
+            </w:pPr>
+            <w:r>
+              <w:t xml:space="preserve">0.9988</w:t>
+            </w:r>
+          </w:p>
+        </w:tc>
+        <w:tc>
+          <w:tcPr/>
+          <w:p>
+            <w:pPr>
+              <w:pStyle w:val="Compact"/>
+            </w:pPr>
+            <w:r>
+              <w:t xml:space="preserve">0.9319</w:t>
+            </w:r>
+          </w:p>
+        </w:tc>
+        <w:tc>
+          <w:tcPr/>
+          <w:p>
+            <w:pPr>
+              <w:pStyle w:val="Compact"/>
+            </w:pPr>
+            <w:r>
+              <w:t xml:space="preserve">0.9642</w:t>
+            </w:r>
+          </w:p>
+        </w:tc>
+        <w:tc>
+          <w:tcPr/>
+          <w:p>
+            <w:pPr>
+              <w:pStyle w:val="Compact"/>
+            </w:pPr>
+            <w:r>
+              <w:t xml:space="preserve">862</w:t>
+            </w:r>
+          </w:p>
+        </w:tc>
+        <w:tc>
+          <w:tcPr/>
+          <w:p>
+            <w:pPr>
+              <w:pStyle w:val="Compact"/>
+            </w:pPr>
+            <w:r>
+              <w:t xml:space="preserve">1</w:t>
+            </w:r>
+          </w:p>
+        </w:tc>
+        <w:tc>
+          <w:tcPr/>
+          <w:p>
+            <w:pPr>
+              <w:pStyle w:val="Compact"/>
+            </w:pPr>
+            <w:r>
+              <w:t xml:space="preserve">63</w:t>
             </w:r>
           </w:p>
         </w:tc>
@@ -3782,86 +3768,73 @@
               <w:pStyle w:val="Compact"/>
             </w:pPr>
             <w:r>
-              <w:t xml:space="preserve">20 percent</w:t>
-            </w:r>
-          </w:p>
-        </w:tc>
-        <w:tc>
-          <w:tcPr/>
-          <w:p>
-            <w:pPr>
-              <w:pStyle w:val="Compact"/>
-            </w:pPr>
-            <w:r>
-              <w:t xml:space="preserve">1.0000</w:t>
-            </w:r>
-          </w:p>
-        </w:tc>
-        <w:tc>
-          <w:tcPr/>
-          <w:p>
-            <w:pPr>
-              <w:pStyle w:val="Compact"/>
-            </w:pPr>
-            <w:r>
-              <w:t xml:space="preserve">1.0000</w:t>
-            </w:r>
-          </w:p>
-        </w:tc>
-        <w:tc>
-          <w:tcPr/>
-          <w:p>
-            <w:pPr>
-              <w:pStyle w:val="Compact"/>
-            </w:pPr>
-            <w:r>
-              <w:t xml:space="preserve">1.0000</w:t>
-            </w:r>
-          </w:p>
-        </w:tc>
-      </w:tr>
-      <w:tr>
-        <w:tc>
-          <w:tcPr/>
-          <w:p>
-            <w:pPr>
-              <w:pStyle w:val="Compact"/>
-            </w:pPr>
-            <w:r>
-              <w:t xml:space="preserve">30 percent</w:t>
-            </w:r>
-          </w:p>
-        </w:tc>
-        <w:tc>
-          <w:tcPr/>
-          <w:p>
-            <w:pPr>
-              <w:pStyle w:val="Compact"/>
-            </w:pPr>
-            <w:r>
-              <w:t xml:space="preserve">1.0000</w:t>
-            </w:r>
-          </w:p>
-        </w:tc>
-        <w:tc>
-          <w:tcPr/>
-          <w:p>
-            <w:pPr>
-              <w:pStyle w:val="Compact"/>
-            </w:pPr>
-            <w:r>
-              <w:t xml:space="preserve">1.0000</w:t>
-            </w:r>
-          </w:p>
-        </w:tc>
-        <w:tc>
-          <w:tcPr/>
-          <w:p>
-            <w:pPr>
-              <w:pStyle w:val="Compact"/>
-            </w:pPr>
-            <w:r>
-              <w:t xml:space="preserve">1.0000</w:t>
+              <w:t xml:space="preserve">IQR only</w:t>
+            </w:r>
+          </w:p>
+        </w:tc>
+        <w:tc>
+          <w:tcPr/>
+          <w:p>
+            <w:pPr>
+              <w:pStyle w:val="Compact"/>
+            </w:pPr>
+            <w:r>
+              <w:t xml:space="preserve">0.6628</w:t>
+            </w:r>
+          </w:p>
+        </w:tc>
+        <w:tc>
+          <w:tcPr/>
+          <w:p>
+            <w:pPr>
+              <w:pStyle w:val="Compact"/>
+            </w:pPr>
+            <w:r>
+              <w:t xml:space="preserve">0.6162</w:t>
+            </w:r>
+          </w:p>
+        </w:tc>
+        <w:tc>
+          <w:tcPr/>
+          <w:p>
+            <w:pPr>
+              <w:pStyle w:val="Compact"/>
+            </w:pPr>
+            <w:r>
+              <w:t xml:space="preserve">0.6387</w:t>
+            </w:r>
+          </w:p>
+        </w:tc>
+        <w:tc>
+          <w:tcPr/>
+          <w:p>
+            <w:pPr>
+              <w:pStyle w:val="Compact"/>
+            </w:pPr>
+            <w:r>
+              <w:t xml:space="preserve">570</w:t>
+            </w:r>
+          </w:p>
+        </w:tc>
+        <w:tc>
+          <w:tcPr/>
+          <w:p>
+            <w:pPr>
+              <w:pStyle w:val="Compact"/>
+            </w:pPr>
+            <w:r>
+              <w:t xml:space="preserve">290</w:t>
+            </w:r>
+          </w:p>
+        </w:tc>
+        <w:tc>
+          <w:tcPr/>
+          <w:p>
+            <w:pPr>
+              <w:pStyle w:val="Compact"/>
+            </w:pPr>
+            <w:r>
+              <w:t xml:space="preserve">355</w:t>
             </w:r>
           </w:p>
         </w:tc>
@@ -3872,367 +3845,7 @@
         <w:pStyle w:val="BodyText"/>
       </w:pPr>
       <w:r>
-        <w:t xml:space="preserve">Recall holds at 1.00 throughout. Precision falls only at 5 percent prevalence,</w:t>
-      </w:r>
-      <w:r>
-        <w:t xml:space="preserve"> </w:t>
-      </w:r>
-      <w:r>
-        <w:t xml:space="preserve">where a single false positive among few true anomalies costs almost four points.</w:t>
-      </w:r>
-      <w:r>
-        <w:t xml:space="preserve"> </w:t>
-      </w:r>
-      <w:r>
-        <w:t xml:space="preserve">This is a property of the metric rather than of the detector, but it matters</w:t>
-      </w:r>
-      <w:r>
-        <w:t xml:space="preserve"> </w:t>
-      </w:r>
-      <w:r>
-        <w:t xml:space="preserve">operationally, because real fabrication rates are usually low and the figure</w:t>
-      </w:r>
-      <w:r>
-        <w:t xml:space="preserve"> </w:t>
-      </w:r>
-      <w:r>
-        <w:t xml:space="preserve">quantifies the review burden a deployment should expect.</w:t>
-      </w:r>
-    </w:p>
-    <w:p>
-      <w:pPr>
-        <w:pStyle w:val="BodyText"/>
-      </w:pPr>
-      <w:r>
-        <w:t xml:space="preserve">Source:</w:t>
-      </w:r>
-      <w:r>
-        <w:t xml:space="preserve"> </w:t>
-      </w:r>
-      <w:r>
-        <w:rPr>
-          <w:rStyle w:val="VerbatimChar"/>
-        </w:rPr>
-        <w:t xml:space="preserve">output/robustness_validation/metrics_sweep_r*.csv</w:t>
-      </w:r>
-      <w:r>
-        <w:t xml:space="preserve">.</w:t>
-      </w:r>
-    </w:p>
-    <w:bookmarkEnd w:id="21"/>
-    <w:bookmarkStart w:id="23" w:name="held-out-stress-evaluation"/>
-    <w:p>
-      <w:pPr>
-        <w:pStyle w:val="Heading2"/>
-      </w:pPr>
-      <w:r>
-        <w:t xml:space="preserve">5. Held-out stress evaluation</w:t>
-      </w:r>
-    </w:p>
-    <w:p>
-      <w:pPr>
-        <w:pStyle w:val="FirstParagraph"/>
-      </w:pPr>
-      <w:r>
-        <w:t xml:space="preserve">The stress generator overlaps the profiles on purpose. Some genuine respondents</w:t>
-      </w:r>
-      <w:r>
-        <w:t xml:space="preserve"> </w:t>
-      </w:r>
-      <w:r>
-        <w:t xml:space="preserve">are fast with no back navigation, and some fabricated interviews are only mildly</w:t>
-      </w:r>
-      <w:r>
-        <w:t xml:space="preserve"> </w:t>
-      </w:r>
-      <w:r>
-        <w:t xml:space="preserve">compressed. Seeds 7 and 99 were never used to develop or calibrate anything.</w:t>
-      </w:r>
-    </w:p>
-    <w:tbl>
-      <w:tblPr>
-        <w:tblStyle w:val="Table"/>
-        <w:tblW w:type="auto" w:w="0"/>
-        <w:tblLook w:firstRow="1" w:lastRow="0" w:firstColumn="0" w:lastColumn="0" w:noHBand="0" w:noVBand="0" w:val="0020"/>
-      </w:tblPr>
-      <w:tblGrid>
-        <w:gridCol w:w="1980"/>
-        <w:gridCol w:w="1980"/>
-        <w:gridCol w:w="1980"/>
-        <w:gridCol w:w="1980"/>
-      </w:tblGrid>
-      <w:tr>
-        <w:trPr>
-          <w:tblHeader w:val="on"/>
-        </w:trPr>
-        <w:tc>
-          <w:tcPr/>
-          <w:p>
-            <w:pPr>
-              <w:pStyle w:val="Compact"/>
-            </w:pPr>
-            <w:r>
-              <w:t xml:space="preserve">Dataset</w:t>
-            </w:r>
-          </w:p>
-        </w:tc>
-        <w:tc>
-          <w:tcPr/>
-          <w:p>
-            <w:pPr>
-              <w:pStyle w:val="Compact"/>
-            </w:pPr>
-            <w:r>
-              <w:t xml:space="preserve">Precision</w:t>
-            </w:r>
-          </w:p>
-        </w:tc>
-        <w:tc>
-          <w:tcPr/>
-          <w:p>
-            <w:pPr>
-              <w:pStyle w:val="Compact"/>
-            </w:pPr>
-            <w:r>
-              <w:t xml:space="preserve">Recall</w:t>
-            </w:r>
-          </w:p>
-        </w:tc>
-        <w:tc>
-          <w:tcPr/>
-          <w:p>
-            <w:pPr>
-              <w:pStyle w:val="Compact"/>
-            </w:pPr>
-            <w:r>
-              <w:t xml:space="preserve">F1</w:t>
-            </w:r>
-          </w:p>
-        </w:tc>
-      </w:tr>
-      <w:tr>
-        <w:tc>
-          <w:tcPr/>
-          <w:p>
-            <w:pPr>
-              <w:pStyle w:val="Compact"/>
-            </w:pPr>
-            <w:r>
-              <w:t xml:space="preserve">Seed 7, SurveyCTO</w:t>
-            </w:r>
-          </w:p>
-        </w:tc>
-        <w:tc>
-          <w:tcPr/>
-          <w:p>
-            <w:pPr>
-              <w:pStyle w:val="Compact"/>
-            </w:pPr>
-            <w:r>
-              <w:t xml:space="preserve">0.9770</w:t>
-            </w:r>
-          </w:p>
-        </w:tc>
-        <w:tc>
-          <w:tcPr/>
-          <w:p>
-            <w:pPr>
-              <w:pStyle w:val="Compact"/>
-            </w:pPr>
-            <w:r>
-              <w:t xml:space="preserve">0.8500</w:t>
-            </w:r>
-          </w:p>
-        </w:tc>
-        <w:tc>
-          <w:tcPr/>
-          <w:p>
-            <w:pPr>
-              <w:pStyle w:val="Compact"/>
-            </w:pPr>
-            <w:r>
-              <w:t xml:space="preserve">0.9091</w:t>
-            </w:r>
-          </w:p>
-        </w:tc>
-      </w:tr>
-      <w:tr>
-        <w:tc>
-          <w:tcPr/>
-          <w:p>
-            <w:pPr>
-              <w:pStyle w:val="Compact"/>
-            </w:pPr>
-            <w:r>
-              <w:t xml:space="preserve">Seed 7, ODK</w:t>
-            </w:r>
-          </w:p>
-        </w:tc>
-        <w:tc>
-          <w:tcPr/>
-          <w:p>
-            <w:pPr>
-              <w:pStyle w:val="Compact"/>
-            </w:pPr>
-            <w:r>
-              <w:t xml:space="preserve">0.9570</w:t>
-            </w:r>
-          </w:p>
-        </w:tc>
-        <w:tc>
-          <w:tcPr/>
-          <w:p>
-            <w:pPr>
-              <w:pStyle w:val="Compact"/>
-            </w:pPr>
-            <w:r>
-              <w:t xml:space="preserve">0.8900</w:t>
-            </w:r>
-          </w:p>
-        </w:tc>
-        <w:tc>
-          <w:tcPr/>
-          <w:p>
-            <w:pPr>
-              <w:pStyle w:val="Compact"/>
-            </w:pPr>
-            <w:r>
-              <w:t xml:space="preserve">0.9223</w:t>
-            </w:r>
-          </w:p>
-        </w:tc>
-      </w:tr>
-      <w:tr>
-        <w:tc>
-          <w:tcPr/>
-          <w:p>
-            <w:pPr>
-              <w:pStyle w:val="Compact"/>
-            </w:pPr>
-            <w:r>
-              <w:t xml:space="preserve">Seed 99, SurveyCTO</w:t>
-            </w:r>
-          </w:p>
-        </w:tc>
-        <w:tc>
-          <w:tcPr/>
-          <w:p>
-            <w:pPr>
-              <w:pStyle w:val="Compact"/>
-            </w:pPr>
-            <w:r>
-              <w:t xml:space="preserve">1.0000</w:t>
-            </w:r>
-          </w:p>
-        </w:tc>
-        <w:tc>
-          <w:tcPr/>
-          <w:p>
-            <w:pPr>
-              <w:pStyle w:val="Compact"/>
-            </w:pPr>
-            <w:r>
-              <w:t xml:space="preserve">0.8800</w:t>
-            </w:r>
-          </w:p>
-        </w:tc>
-        <w:tc>
-          <w:tcPr/>
-          <w:p>
-            <w:pPr>
-              <w:pStyle w:val="Compact"/>
-            </w:pPr>
-            <w:r>
-              <w:t xml:space="preserve">0.9362</w:t>
-            </w:r>
-          </w:p>
-        </w:tc>
-      </w:tr>
-      <w:tr>
-        <w:tc>
-          <w:tcPr/>
-          <w:p>
-            <w:pPr>
-              <w:pStyle w:val="Compact"/>
-            </w:pPr>
-            <w:r>
-              <w:t xml:space="preserve">Seed 99, ODK</w:t>
-            </w:r>
-          </w:p>
-        </w:tc>
-        <w:tc>
-          <w:tcPr/>
-          <w:p>
-            <w:pPr>
-              <w:pStyle w:val="Compact"/>
-            </w:pPr>
-            <w:r>
-              <w:t xml:space="preserve">1.0000</w:t>
-            </w:r>
-          </w:p>
-        </w:tc>
-        <w:tc>
-          <w:tcPr/>
-          <w:p>
-            <w:pPr>
-              <w:pStyle w:val="Compact"/>
-            </w:pPr>
-            <w:r>
-              <w:t xml:space="preserve">0.8400</w:t>
-            </w:r>
-          </w:p>
-        </w:tc>
-        <w:tc>
-          <w:tcPr/>
-          <w:p>
-            <w:pPr>
-              <w:pStyle w:val="Compact"/>
-            </w:pPr>
-            <w:r>
-              <w:t xml:space="preserve">0.9130</w:t>
-            </w:r>
-          </w:p>
-        </w:tc>
-      </w:tr>
-    </w:tbl>
-    <w:p>
-      <w:pPr>
-        <w:pStyle w:val="BodyText"/>
-      </w:pPr>
-      <w:r>
-        <w:t xml:space="preserve">All four runs clear both success criteria, and performance is consistent across</w:t>
-      </w:r>
-      <w:r>
-        <w:t xml:space="preserve"> </w:t>
-      </w:r>
-      <w:r>
-        <w:t xml:space="preserve">the two platform formats. That consistency is itself a result: the same detector,</w:t>
-      </w:r>
-      <w:r>
-        <w:t xml:space="preserve"> </w:t>
-      </w:r>
-      <w:r>
-        <w:t xml:space="preserve">unmodified, performs equivalently on structurally different inputs, which is what</w:t>
-      </w:r>
-      <w:r>
-        <w:t xml:space="preserve"> </w:t>
-      </w:r>
-      <w:r>
-        <w:t xml:space="preserve">the common intermediate representation was designed to achieve.</w:t>
-      </w:r>
-    </w:p>
-    <w:p>
-      <w:pPr>
-        <w:pStyle w:val="BodyText"/>
-      </w:pPr>
-      <w:r>
-        <w:t xml:space="preserve">Per-class recall by anomaly type, all four runs. Each cell is the count of that</w:t>
-      </w:r>
-      <w:r>
-        <w:t xml:space="preserve"> </w:t>
-      </w:r>
-      <w:r>
-        <w:t xml:space="preserve">injected class the detector flagged, over the count present:</w:t>
+        <w:t xml:space="preserve">Per run:</w:t>
       </w:r>
     </w:p>
     <w:tbl>
@@ -4270,6 +3883,1669 @@
               <w:pStyle w:val="Compact"/>
             </w:pPr>
             <w:r>
+              <w:t xml:space="preserve">Combined P / R</w:t>
+            </w:r>
+          </w:p>
+        </w:tc>
+        <w:tc>
+          <w:tcPr/>
+          <w:p>
+            <w:pPr>
+              <w:pStyle w:val="Compact"/>
+            </w:pPr>
+            <w:r>
+              <w:t xml:space="preserve">Rules only P / R</w:t>
+            </w:r>
+          </w:p>
+        </w:tc>
+        <w:tc>
+          <w:tcPr/>
+          <w:p>
+            <w:pPr>
+              <w:pStyle w:val="Compact"/>
+            </w:pPr>
+            <w:r>
+              <w:t xml:space="preserve">IQR only P / R</w:t>
+            </w:r>
+          </w:p>
+        </w:tc>
+      </w:tr>
+      <w:tr>
+        <w:tc>
+          <w:tcPr/>
+          <w:p>
+            <w:pPr>
+              <w:pStyle w:val="Compact"/>
+            </w:pPr>
+            <w:r>
+              <w:rPr>
+                <w:rStyle w:val="VerbatimChar"/>
+              </w:rPr>
+              <w:t xml:space="preserve">benchmark_n500_odk</w:t>
+            </w:r>
+          </w:p>
+        </w:tc>
+        <w:tc>
+          <w:tcPr/>
+          <w:p>
+            <w:pPr>
+              <w:pStyle w:val="Compact"/>
+            </w:pPr>
+            <w:r>
+              <w:t xml:space="preserve">1.0000 / 1.0000</w:t>
+            </w:r>
+          </w:p>
+        </w:tc>
+        <w:tc>
+          <w:tcPr/>
+          <w:p>
+            <w:pPr>
+              <w:pStyle w:val="Compact"/>
+            </w:pPr>
+            <w:r>
+              <w:t xml:space="preserve">1.0000 / 1.0000</w:t>
+            </w:r>
+          </w:p>
+        </w:tc>
+        <w:tc>
+          <w:tcPr/>
+          <w:p>
+            <w:pPr>
+              <w:pStyle w:val="Compact"/>
+            </w:pPr>
+            <w:r>
+              <w:t xml:space="preserve">0.8547 / 1.0000</w:t>
+            </w:r>
+          </w:p>
+        </w:tc>
+      </w:tr>
+      <w:tr>
+        <w:tc>
+          <w:tcPr/>
+          <w:p>
+            <w:pPr>
+              <w:pStyle w:val="Compact"/>
+            </w:pPr>
+            <w:r>
+              <w:rPr>
+                <w:rStyle w:val="VerbatimChar"/>
+              </w:rPr>
+              <w:t xml:space="preserve">benchmark_n500_surveycto</w:t>
+            </w:r>
+          </w:p>
+        </w:tc>
+        <w:tc>
+          <w:tcPr/>
+          <w:p>
+            <w:pPr>
+              <w:pStyle w:val="Compact"/>
+            </w:pPr>
+            <w:r>
+              <w:t xml:space="preserve">1.0000 / 1.0000</w:t>
+            </w:r>
+          </w:p>
+        </w:tc>
+        <w:tc>
+          <w:tcPr/>
+          <w:p>
+            <w:pPr>
+              <w:pStyle w:val="Compact"/>
+            </w:pPr>
+            <w:r>
+              <w:t xml:space="preserve">1.0000 / 1.0000</w:t>
+            </w:r>
+          </w:p>
+        </w:tc>
+        <w:tc>
+          <w:tcPr/>
+          <w:p>
+            <w:pPr>
+              <w:pStyle w:val="Compact"/>
+            </w:pPr>
+            <w:r>
+              <w:t xml:space="preserve">0.8929 / 1.0000</w:t>
+            </w:r>
+          </w:p>
+        </w:tc>
+      </w:tr>
+      <w:tr>
+        <w:tc>
+          <w:tcPr/>
+          <w:p>
+            <w:pPr>
+              <w:pStyle w:val="Compact"/>
+            </w:pPr>
+            <w:r>
+              <w:rPr>
+                <w:rStyle w:val="VerbatimChar"/>
+              </w:rPr>
+              <w:t xml:space="preserve">stress_seed7_odk</w:t>
+            </w:r>
+          </w:p>
+        </w:tc>
+        <w:tc>
+          <w:tcPr/>
+          <w:p>
+            <w:pPr>
+              <w:pStyle w:val="Compact"/>
+            </w:pPr>
+            <w:r>
+              <w:t xml:space="preserve">0.9570 / 0.8900</w:t>
+            </w:r>
+          </w:p>
+        </w:tc>
+        <w:tc>
+          <w:tcPr/>
+          <w:p>
+            <w:pPr>
+              <w:pStyle w:val="Compact"/>
+            </w:pPr>
+            <w:r>
+              <w:t xml:space="preserve">0.9884 / 0.8500</w:t>
+            </w:r>
+          </w:p>
+        </w:tc>
+        <w:tc>
+          <w:tcPr/>
+          <w:p>
+            <w:pPr>
+              <w:pStyle w:val="Compact"/>
+            </w:pPr>
+            <w:r>
+              <w:t xml:space="preserve">0.3784 / 0.2800</w:t>
+            </w:r>
+          </w:p>
+        </w:tc>
+      </w:tr>
+      <w:tr>
+        <w:tc>
+          <w:tcPr/>
+          <w:p>
+            <w:pPr>
+              <w:pStyle w:val="Compact"/>
+            </w:pPr>
+            <w:r>
+              <w:rPr>
+                <w:rStyle w:val="VerbatimChar"/>
+              </w:rPr>
+              <w:t xml:space="preserve">stress_seed7_surveycto</w:t>
+            </w:r>
+          </w:p>
+        </w:tc>
+        <w:tc>
+          <w:tcPr/>
+          <w:p>
+            <w:pPr>
+              <w:pStyle w:val="Compact"/>
+            </w:pPr>
+            <w:r>
+              <w:t xml:space="preserve">0.9770 / 0.8500</w:t>
+            </w:r>
+          </w:p>
+        </w:tc>
+        <w:tc>
+          <w:tcPr/>
+          <w:p>
+            <w:pPr>
+              <w:pStyle w:val="Compact"/>
+            </w:pPr>
+            <w:r>
+              <w:t xml:space="preserve">1.0000 / 0.8100</w:t>
+            </w:r>
+          </w:p>
+        </w:tc>
+        <w:tc>
+          <w:tcPr/>
+          <w:p>
+            <w:pPr>
+              <w:pStyle w:val="Compact"/>
+            </w:pPr>
+            <w:r>
+              <w:t xml:space="preserve">0.3158 / 0.2400</w:t>
+            </w:r>
+          </w:p>
+        </w:tc>
+      </w:tr>
+      <w:tr>
+        <w:tc>
+          <w:tcPr/>
+          <w:p>
+            <w:pPr>
+              <w:pStyle w:val="Compact"/>
+            </w:pPr>
+            <w:r>
+              <w:rPr>
+                <w:rStyle w:val="VerbatimChar"/>
+              </w:rPr>
+              <w:t xml:space="preserve">stress_seed99_odk</w:t>
+            </w:r>
+          </w:p>
+        </w:tc>
+        <w:tc>
+          <w:tcPr/>
+          <w:p>
+            <w:pPr>
+              <w:pStyle w:val="Compact"/>
+            </w:pPr>
+            <w:r>
+              <w:t xml:space="preserve">1.0000 / 0.8400</w:t>
+            </w:r>
+          </w:p>
+        </w:tc>
+        <w:tc>
+          <w:tcPr/>
+          <w:p>
+            <w:pPr>
+              <w:pStyle w:val="Compact"/>
+            </w:pPr>
+            <w:r>
+              <w:t xml:space="preserve">1.0000 / 0.8300</w:t>
+            </w:r>
+          </w:p>
+        </w:tc>
+        <w:tc>
+          <w:tcPr/>
+          <w:p>
+            <w:pPr>
+              <w:pStyle w:val="Compact"/>
+            </w:pPr>
+            <w:r>
+              <w:t xml:space="preserve">0.3167 / 0.1900</w:t>
+            </w:r>
+          </w:p>
+        </w:tc>
+      </w:tr>
+      <w:tr>
+        <w:tc>
+          <w:tcPr/>
+          <w:p>
+            <w:pPr>
+              <w:pStyle w:val="Compact"/>
+            </w:pPr>
+            <w:r>
+              <w:rPr>
+                <w:rStyle w:val="VerbatimChar"/>
+              </w:rPr>
+              <w:t xml:space="preserve">stress_seed99_surveycto</w:t>
+            </w:r>
+          </w:p>
+        </w:tc>
+        <w:tc>
+          <w:tcPr/>
+          <w:p>
+            <w:pPr>
+              <w:pStyle w:val="Compact"/>
+            </w:pPr>
+            <w:r>
+              <w:t xml:space="preserve">1.0000 / 0.8800</w:t>
+            </w:r>
+          </w:p>
+        </w:tc>
+        <w:tc>
+          <w:tcPr/>
+          <w:p>
+            <w:pPr>
+              <w:pStyle w:val="Compact"/>
+            </w:pPr>
+            <w:r>
+              <w:t xml:space="preserve">1.0000 / 0.8800</w:t>
+            </w:r>
+          </w:p>
+        </w:tc>
+        <w:tc>
+          <w:tcPr/>
+          <w:p>
+            <w:pPr>
+              <w:pStyle w:val="Compact"/>
+            </w:pPr>
+            <w:r>
+              <w:t xml:space="preserve">0.3200 / 0.2400</w:t>
+            </w:r>
+          </w:p>
+        </w:tc>
+      </w:tr>
+      <w:tr>
+        <w:tc>
+          <w:tcPr/>
+          <w:p>
+            <w:pPr>
+              <w:pStyle w:val="Compact"/>
+            </w:pPr>
+            <w:r>
+              <w:rPr>
+                <w:rStyle w:val="VerbatimChar"/>
+              </w:rPr>
+              <w:t xml:space="preserve">sweep_r005</w:t>
+            </w:r>
+          </w:p>
+        </w:tc>
+        <w:tc>
+          <w:tcPr/>
+          <w:p>
+            <w:pPr>
+              <w:pStyle w:val="Compact"/>
+            </w:pPr>
+            <w:r>
+              <w:t xml:space="preserve">0.9615 / 1.0000</w:t>
+            </w:r>
+          </w:p>
+        </w:tc>
+        <w:tc>
+          <w:tcPr/>
+          <w:p>
+            <w:pPr>
+              <w:pStyle w:val="Compact"/>
+            </w:pPr>
+            <w:r>
+              <w:t xml:space="preserve">1.0000 / 1.0000</w:t>
+            </w:r>
+          </w:p>
+        </w:tc>
+        <w:tc>
+          <w:tcPr/>
+          <w:p>
+            <w:pPr>
+              <w:pStyle w:val="Compact"/>
+            </w:pPr>
+            <w:r>
+              <w:t xml:space="preserve">0.4717 / 1.0000</w:t>
+            </w:r>
+          </w:p>
+        </w:tc>
+      </w:tr>
+      <w:tr>
+        <w:tc>
+          <w:tcPr/>
+          <w:p>
+            <w:pPr>
+              <w:pStyle w:val="Compact"/>
+            </w:pPr>
+            <w:r>
+              <w:rPr>
+                <w:rStyle w:val="VerbatimChar"/>
+              </w:rPr>
+              <w:t xml:space="preserve">sweep_r010</w:t>
+            </w:r>
+          </w:p>
+        </w:tc>
+        <w:tc>
+          <w:tcPr/>
+          <w:p>
+            <w:pPr>
+              <w:pStyle w:val="Compact"/>
+            </w:pPr>
+            <w:r>
+              <w:t xml:space="preserve">1.0000 / 1.0000</w:t>
+            </w:r>
+          </w:p>
+        </w:tc>
+        <w:tc>
+          <w:tcPr/>
+          <w:p>
+            <w:pPr>
+              <w:pStyle w:val="Compact"/>
+            </w:pPr>
+            <w:r>
+              <w:t xml:space="preserve">1.0000 / 1.0000</w:t>
+            </w:r>
+          </w:p>
+        </w:tc>
+        <w:tc>
+          <w:tcPr/>
+          <w:p>
+            <w:pPr>
+              <w:pStyle w:val="Compact"/>
+            </w:pPr>
+            <w:r>
+              <w:t xml:space="preserve">0.6667 / 1.0000</w:t>
+            </w:r>
+          </w:p>
+        </w:tc>
+      </w:tr>
+      <w:tr>
+        <w:tc>
+          <w:tcPr/>
+          <w:p>
+            <w:pPr>
+              <w:pStyle w:val="Compact"/>
+            </w:pPr>
+            <w:r>
+              <w:rPr>
+                <w:rStyle w:val="VerbatimChar"/>
+              </w:rPr>
+              <w:t xml:space="preserve">sweep_r020</w:t>
+            </w:r>
+          </w:p>
+        </w:tc>
+        <w:tc>
+          <w:tcPr/>
+          <w:p>
+            <w:pPr>
+              <w:pStyle w:val="Compact"/>
+            </w:pPr>
+            <w:r>
+              <w:t xml:space="preserve">1.0000 / 1.0000</w:t>
+            </w:r>
+          </w:p>
+        </w:tc>
+        <w:tc>
+          <w:tcPr/>
+          <w:p>
+            <w:pPr>
+              <w:pStyle w:val="Compact"/>
+            </w:pPr>
+            <w:r>
+              <w:t xml:space="preserve">1.0000 / 1.0000</w:t>
+            </w:r>
+          </w:p>
+        </w:tc>
+        <w:tc>
+          <w:tcPr/>
+          <w:p>
+            <w:pPr>
+              <w:pStyle w:val="Compact"/>
+            </w:pPr>
+            <w:r>
+              <w:t xml:space="preserve">0.9174 / 1.0000</w:t>
+            </w:r>
+          </w:p>
+        </w:tc>
+      </w:tr>
+      <w:tr>
+        <w:tc>
+          <w:tcPr/>
+          <w:p>
+            <w:pPr>
+              <w:pStyle w:val="Compact"/>
+            </w:pPr>
+            <w:r>
+              <w:rPr>
+                <w:rStyle w:val="VerbatimChar"/>
+              </w:rPr>
+              <w:t xml:space="preserve">sweep_r030</w:t>
+            </w:r>
+          </w:p>
+        </w:tc>
+        <w:tc>
+          <w:tcPr/>
+          <w:p>
+            <w:pPr>
+              <w:pStyle w:val="Compact"/>
+            </w:pPr>
+            <w:r>
+              <w:t xml:space="preserve">1.0000 / 1.0000</w:t>
+            </w:r>
+          </w:p>
+        </w:tc>
+        <w:tc>
+          <w:tcPr/>
+          <w:p>
+            <w:pPr>
+              <w:pStyle w:val="Compact"/>
+            </w:pPr>
+            <w:r>
+              <w:t xml:space="preserve">1.0000 / 1.0000</w:t>
+            </w:r>
+          </w:p>
+        </w:tc>
+        <w:tc>
+          <w:tcPr/>
+          <w:p>
+            <w:pPr>
+              <w:pStyle w:val="Compact"/>
+            </w:pPr>
+            <w:r>
+              <w:t xml:space="preserve">0.9174 / 0.6667</w:t>
+            </w:r>
+          </w:p>
+        </w:tc>
+      </w:tr>
+    </w:tbl>
+    <w:bookmarkStart w:id="20" w:name="what-the-breakdown-shows"/>
+    <w:p>
+      <w:pPr>
+        <w:pStyle w:val="Heading3"/>
+      </w:pPr>
+      <w:r>
+        <w:t xml:space="preserve">What the breakdown shows</w:t>
+      </w:r>
+    </w:p>
+    <w:p>
+      <w:pPr>
+        <w:pStyle w:val="FirstParagraph"/>
+      </w:pPr>
+      <w:r>
+        <w:t xml:space="preserve">The rule layer carries the detection. On its own it reaches precision 0.9988 and</w:t>
+      </w:r>
+      <w:r>
+        <w:t xml:space="preserve"> </w:t>
+      </w:r>
+      <w:r>
+        <w:t xml:space="preserve">recall 0.9319, which is within a point of the combined detector on both measures.</w:t>
+      </w:r>
+      <w:r>
+        <w:t xml:space="preserve"> </w:t>
+      </w:r>
+      <w:r>
+        <w:t xml:space="preserve">The IQR layer on its own reaches precision 0.6628 and recall 0.6162, and under</w:t>
+      </w:r>
+      <w:r>
+        <w:t xml:space="preserve"> </w:t>
+      </w:r>
+      <w:r>
+        <w:t xml:space="preserve">the stress condition its recall falls to between 0.19 and 0.28.</w:t>
+      </w:r>
+    </w:p>
+    <w:p>
+      <w:pPr>
+        <w:pStyle w:val="BodyText"/>
+      </w:pPr>
+      <w:r>
+        <w:t xml:space="preserve">Combining the two is nonetheless worth doing, but the margin is small and should</w:t>
+      </w:r>
+      <w:r>
+        <w:t xml:space="preserve"> </w:t>
+      </w:r>
+      <w:r>
+        <w:t xml:space="preserve">be stated as such: the combination recovers nine true positives that the rules</w:t>
+      </w:r>
+      <w:r>
+        <w:t xml:space="preserve"> </w:t>
+      </w:r>
+      <w:r>
+        <w:t xml:space="preserve">miss, lifting recall from 0.9319 to 0.9416, and costs six additional false</w:t>
+      </w:r>
+      <w:r>
+        <w:t xml:space="preserve"> </w:t>
+      </w:r>
+      <w:r>
+        <w:t xml:space="preserve">positives, moving precision from 0.9988 to 0.9920. That is the entire measured</w:t>
+      </w:r>
+      <w:r>
+        <w:t xml:space="preserve"> </w:t>
+      </w:r>
+      <w:r>
+        <w:t xml:space="preserve">contribution of the IQR component in the shipped configuration.</w:t>
+      </w:r>
+    </w:p>
+    <w:p>
+      <w:pPr>
+        <w:pStyle w:val="BodyText"/>
+      </w:pPr>
+      <w:r>
+        <w:t xml:space="preserve">The IQR component also degrades in a specific and instructive way. Across the</w:t>
+      </w:r>
+      <w:r>
+        <w:t xml:space="preserve"> </w:t>
+      </w:r>
+      <w:r>
+        <w:t xml:space="preserve">class imbalance sweep its recall holds at 1.00 while anomalies make up 5, 10 and</w:t>
+      </w:r>
+      <w:r>
+        <w:t xml:space="preserve"> </w:t>
+      </w:r>
+      <w:r>
+        <w:t xml:space="preserve">20 percent of the sample, then falls to 0.6667 at 30 percent. This is masking:</w:t>
+      </w:r>
+      <w:r>
+        <w:t xml:space="preserve"> </w:t>
+      </w:r>
+      <w:r>
+        <w:t xml:space="preserve">the fences are estimated from a sample that contains the outliers they are meant</w:t>
+      </w:r>
+      <w:r>
+        <w:t xml:space="preserve"> </w:t>
+      </w:r>
+      <w:r>
+        <w:t xml:space="preserve">to isolate, so as contamination rises the quartiles move with it and the fences</w:t>
+      </w:r>
+      <w:r>
+        <w:t xml:space="preserve"> </w:t>
+      </w:r>
+      <w:r>
+        <w:t xml:space="preserve">stop reaching the anomalies. The same mechanism accounts for part of the</w:t>
+      </w:r>
+      <w:r>
+        <w:t xml:space="preserve"> </w:t>
+      </w:r>
+      <w:r>
+        <w:t xml:space="preserve">fabricated recall shortfall analysed in</w:t>
+      </w:r>
+      <w:r>
+        <w:t xml:space="preserve"> </w:t>
+      </w:r>
+      <w:r>
+        <w:rPr>
+          <w:rStyle w:val="VerbatimChar"/>
+        </w:rPr>
+        <w:t xml:space="preserve">docs/fabricated_detection_diagnostic.md</w:t>
+      </w:r>
+      <w:r>
+        <w:t xml:space="preserve">, and it is a property of applying</w:t>
+      </w:r>
+      <w:r>
+        <w:t xml:space="preserve"> </w:t>
+      </w:r>
+      <w:r>
+        <w:t xml:space="preserve">unsupervised fences to contaminated data rather than a defect in the</w:t>
+      </w:r>
+      <w:r>
+        <w:t xml:space="preserve"> </w:t>
+      </w:r>
+      <w:r>
+        <w:t xml:space="preserve">implementation.</w:t>
+      </w:r>
+    </w:p>
+    <w:p>
+      <w:pPr>
+        <w:pStyle w:val="BodyText"/>
+      </w:pPr>
+      <w:r>
+        <w:t xml:space="preserve">This breakdown is regenerated from the recorded predictions, not from a fresh</w:t>
+      </w:r>
+      <w:r>
+        <w:t xml:space="preserve"> </w:t>
+      </w:r>
+      <w:r>
+        <w:t xml:space="preserve">run, with:</w:t>
+      </w:r>
+    </w:p>
+    <w:p>
+      <w:pPr>
+        <w:pStyle w:val="SourceCode"/>
+      </w:pPr>
+      <w:r>
+        <w:rPr>
+          <w:rStyle w:val="ExtensionTok"/>
+        </w:rPr>
+        <w:t xml:space="preserve">python</w:t>
+      </w:r>
+      <w:r>
+        <w:rPr>
+          <w:rStyle w:val="NormalTok"/>
+        </w:rPr>
+        <w:t xml:space="preserve"> scripts/component_breakdown.py</w:t>
+      </w:r>
+    </w:p>
+    <w:p>
+      <w:pPr>
+        <w:pStyle w:val="FirstParagraph"/>
+      </w:pPr>
+      <w:r>
+        <w:t xml:space="preserve">Full per-run values including confusion counts:</w:t>
+      </w:r>
+      <w:r>
+        <w:t xml:space="preserve"> </w:t>
+      </w:r>
+      <w:r>
+        <w:rPr>
+          <w:rStyle w:val="VerbatimChar"/>
+        </w:rPr>
+        <w:t xml:space="preserve">output/robustness_validation/component_breakdown.csv</w:t>
+      </w:r>
+      <w:r>
+        <w:t xml:space="preserve">.</w:t>
+      </w:r>
+    </w:p>
+    <w:bookmarkEnd w:id="20"/>
+    <w:bookmarkEnd w:id="21"/>
+    <w:bookmarkStart w:id="22" w:name="canonical-validation-set"/>
+    <w:p>
+      <w:pPr>
+        <w:pStyle w:val="Heading2"/>
+      </w:pPr>
+      <w:r>
+        <w:t xml:space="preserve">3. Canonical validation set</w:t>
+      </w:r>
+    </w:p>
+    <w:p>
+      <w:pPr>
+        <w:pStyle w:val="FirstParagraph"/>
+      </w:pPr>
+      <w:r>
+        <w:t xml:space="preserve">The canonical labelled run is the contract test. It uses clean, reproducible</w:t>
+      </w:r>
+      <w:r>
+        <w:t xml:space="preserve"> </w:t>
+      </w:r>
+      <w:r>
+        <w:t xml:space="preserve">profiles and is deliberately easy, so it verifies the intended mapping between</w:t>
+      </w:r>
+      <w:r>
+        <w:t xml:space="preserve"> </w:t>
+      </w:r>
+      <w:r>
+        <w:t xml:space="preserve">profile and category rather than proving field performance.</w:t>
+      </w:r>
+    </w:p>
+    <w:p>
+      <w:pPr>
+        <w:pStyle w:val="SourceCode"/>
+      </w:pPr>
+      <w:r>
+        <w:rPr>
+          <w:rStyle w:val="ExtensionTok"/>
+        </w:rPr>
+        <w:t xml:space="preserve">python</w:t>
+      </w:r>
+      <w:r>
+        <w:rPr>
+          <w:rStyle w:val="NormalTok"/>
+        </w:rPr>
+        <w:t xml:space="preserve"> run_pipeline.py </w:t>
+      </w:r>
+      <w:r>
+        <w:rPr>
+          <w:rStyle w:val="DataTypeTok"/>
+        </w:rPr>
+        <w:t xml:space="preserve">\</w:t>
+      </w:r>
+      <w:r>
+        <w:br/>
+      </w:r>
+      <w:r>
+        <w:rPr>
+          <w:rStyle w:val="NormalTok"/>
+        </w:rPr>
+        <w:t xml:space="preserve">  </w:t>
+      </w:r>
+      <w:r>
+        <w:rPr>
+          <w:rStyle w:val="AttributeTok"/>
+        </w:rPr>
+        <w:t xml:space="preserve">--inputs</w:t>
+      </w:r>
+      <w:r>
+        <w:rPr>
+          <w:rStyle w:val="NormalTok"/>
+        </w:rPr>
+        <w:t xml:space="preserve"> data/workflow_validation/canonical_validation/odk.csv data/workflow_validation/canonical_validation/surveycto.csv </w:t>
+      </w:r>
+      <w:r>
+        <w:rPr>
+          <w:rStyle w:val="DataTypeTok"/>
+        </w:rPr>
+        <w:t xml:space="preserve">\</w:t>
+      </w:r>
+      <w:r>
+        <w:br/>
+      </w:r>
+      <w:r>
+        <w:rPr>
+          <w:rStyle w:val="NormalTok"/>
+        </w:rPr>
+        <w:t xml:space="preserve">  </w:t>
+      </w:r>
+      <w:r>
+        <w:rPr>
+          <w:rStyle w:val="AttributeTok"/>
+        </w:rPr>
+        <w:t xml:space="preserve">--parser</w:t>
+      </w:r>
+      <w:r>
+        <w:rPr>
+          <w:rStyle w:val="NormalTok"/>
+        </w:rPr>
+        <w:t xml:space="preserve"> auto </w:t>
+      </w:r>
+      <w:r>
+        <w:rPr>
+          <w:rStyle w:val="DataTypeTok"/>
+        </w:rPr>
+        <w:t xml:space="preserve">\</w:t>
+      </w:r>
+      <w:r>
+        <w:br/>
+      </w:r>
+      <w:r>
+        <w:rPr>
+          <w:rStyle w:val="NormalTok"/>
+        </w:rPr>
+        <w:t xml:space="preserve">  </w:t>
+      </w:r>
+      <w:r>
+        <w:rPr>
+          <w:rStyle w:val="AttributeTok"/>
+        </w:rPr>
+        <w:t xml:space="preserve">--output-dir</w:t>
+      </w:r>
+      <w:r>
+        <w:rPr>
+          <w:rStyle w:val="NormalTok"/>
+        </w:rPr>
+        <w:t xml:space="preserve"> output </w:t>
+      </w:r>
+      <w:r>
+        <w:rPr>
+          <w:rStyle w:val="DataTypeTok"/>
+        </w:rPr>
+        <w:t xml:space="preserve">\</w:t>
+      </w:r>
+      <w:r>
+        <w:br/>
+      </w:r>
+      <w:r>
+        <w:rPr>
+          <w:rStyle w:val="NormalTok"/>
+        </w:rPr>
+        <w:t xml:space="preserve">  </w:t>
+      </w:r>
+      <w:r>
+        <w:rPr>
+          <w:rStyle w:val="AttributeTok"/>
+        </w:rPr>
+        <w:t xml:space="preserve">--label</w:t>
+      </w:r>
+      <w:r>
+        <w:rPr>
+          <w:rStyle w:val="NormalTok"/>
+        </w:rPr>
+        <w:t xml:space="preserve"> canonical_validation </w:t>
+      </w:r>
+      <w:r>
+        <w:rPr>
+          <w:rStyle w:val="DataTypeTok"/>
+        </w:rPr>
+        <w:t xml:space="preserve">\</w:t>
+      </w:r>
+      <w:r>
+        <w:br/>
+      </w:r>
+      <w:r>
+        <w:rPr>
+          <w:rStyle w:val="NormalTok"/>
+        </w:rPr>
+        <w:t xml:space="preserve">  </w:t>
+      </w:r>
+      <w:r>
+        <w:rPr>
+          <w:rStyle w:val="AttributeTok"/>
+        </w:rPr>
+        <w:t xml:space="preserve">--ground-truth</w:t>
+      </w:r>
+      <w:r>
+        <w:rPr>
+          <w:rStyle w:val="NormalTok"/>
+        </w:rPr>
+        <w:t xml:space="preserve"> data/workflow_validation/canonical_validation/ground_truth_labels.csv</w:t>
+      </w:r>
+    </w:p>
+    <w:p>
+      <w:pPr>
+        <w:pStyle w:val="FirstParagraph"/>
+      </w:pPr>
+      <w:r>
+        <w:t xml:space="preserve">Verified result: precision 1.0000, recall 1.0000, F1 1.0000.</w:t>
+      </w:r>
+    </w:p>
+    <w:p>
+      <w:pPr>
+        <w:pStyle w:val="BodyText"/>
+      </w:pPr>
+      <w:r>
+        <w:t xml:space="preserve">The run writes</w:t>
+      </w:r>
+      <w:r>
+        <w:t xml:space="preserve"> </w:t>
+      </w:r>
+      <w:r>
+        <w:rPr>
+          <w:rStyle w:val="VerbatimChar"/>
+        </w:rPr>
+        <w:t xml:space="preserve">output/question_features_canonical_validation.csv</w:t>
+      </w:r>
+      <w:r>
+        <w:t xml:space="preserve">,</w:t>
+      </w:r>
+      <w:r>
+        <w:t xml:space="preserve"> </w:t>
+      </w:r>
+      <w:r>
+        <w:rPr>
+          <w:rStyle w:val="VerbatimChar"/>
+        </w:rPr>
+        <w:t xml:space="preserve">output/section_features_canonical_validation.csv</w:t>
+      </w:r>
+      <w:r>
+        <w:t xml:space="preserve">,</w:t>
+      </w:r>
+      <w:r>
+        <w:t xml:space="preserve"> </w:t>
+      </w:r>
+      <w:r>
+        <w:rPr>
+          <w:rStyle w:val="VerbatimChar"/>
+        </w:rPr>
+        <w:t xml:space="preserve">output/feature_dataset_canonical_validation.csv</w:t>
+      </w:r>
+      <w:r>
+        <w:t xml:space="preserve">,</w:t>
+      </w:r>
+      <w:r>
+        <w:t xml:space="preserve"> </w:t>
+      </w:r>
+      <w:r>
+        <w:rPr>
+          <w:rStyle w:val="VerbatimChar"/>
+        </w:rPr>
+        <w:t xml:space="preserve">output/anomaly_report_canonical_validation.csv</w:t>
+      </w:r>
+      <w:r>
+        <w:t xml:space="preserve">,</w:t>
+      </w:r>
+      <w:r>
+        <w:t xml:space="preserve"> </w:t>
+      </w:r>
+      <w:r>
+        <w:rPr>
+          <w:rStyle w:val="VerbatimChar"/>
+        </w:rPr>
+        <w:t xml:space="preserve">output/pipeline_output_canonical_validation.csv</w:t>
+      </w:r>
+      <w:r>
+        <w:t xml:space="preserve">,</w:t>
+      </w:r>
+      <w:r>
+        <w:t xml:space="preserve"> </w:t>
+      </w:r>
+      <w:r>
+        <w:rPr>
+          <w:rStyle w:val="VerbatimChar"/>
+        </w:rPr>
+        <w:t xml:space="preserve">output/predictions_canonical_validation.csv</w:t>
+      </w:r>
+      <w:r>
+        <w:t xml:space="preserve"> </w:t>
+      </w:r>
+      <w:r>
+        <w:t xml:space="preserve">and</w:t>
+      </w:r>
+      <w:r>
+        <w:t xml:space="preserve"> </w:t>
+      </w:r>
+      <w:r>
+        <w:rPr>
+          <w:rStyle w:val="VerbatimChar"/>
+        </w:rPr>
+        <w:t xml:space="preserve">output/metrics_canonical_validation.{csv,json,md}</w:t>
+      </w:r>
+      <w:r>
+        <w:t xml:space="preserve">.</w:t>
+      </w:r>
+    </w:p>
+    <w:bookmarkEnd w:id="22"/>
+    <w:bookmarkStart w:id="23" w:name="class-imbalance-sweep"/>
+    <w:p>
+      <w:pPr>
+        <w:pStyle w:val="Heading2"/>
+      </w:pPr>
+      <w:r>
+        <w:t xml:space="preserve">4. Class imbalance sweep</w:t>
+      </w:r>
+    </w:p>
+    <w:p>
+      <w:pPr>
+        <w:pStyle w:val="FirstParagraph"/>
+      </w:pPr>
+      <w:r>
+        <w:t xml:space="preserve">Held-out seed 7, canonical difficulty, SurveyCTO, 500 interviews, with the</w:t>
+      </w:r>
+      <w:r>
+        <w:t xml:space="preserve"> </w:t>
+      </w:r>
+      <w:r>
+        <w:t xml:space="preserve">proportion of anomalies varied.</w:t>
+      </w:r>
+    </w:p>
+    <w:tbl>
+      <w:tblPr>
+        <w:tblStyle w:val="Table"/>
+        <w:tblW w:type="auto" w:w="0"/>
+        <w:tblLook w:firstRow="1" w:lastRow="0" w:firstColumn="0" w:lastColumn="0" w:noHBand="0" w:noVBand="0" w:val="0020"/>
+      </w:tblPr>
+      <w:tblGrid>
+        <w:gridCol w:w="1980"/>
+        <w:gridCol w:w="1980"/>
+        <w:gridCol w:w="1980"/>
+        <w:gridCol w:w="1980"/>
+      </w:tblGrid>
+      <w:tr>
+        <w:trPr>
+          <w:tblHeader w:val="on"/>
+        </w:trPr>
+        <w:tc>
+          <w:tcPr/>
+          <w:p>
+            <w:pPr>
+              <w:pStyle w:val="Compact"/>
+            </w:pPr>
+            <w:r>
+              <w:t xml:space="preserve">Anomaly prevalence</w:t>
+            </w:r>
+          </w:p>
+        </w:tc>
+        <w:tc>
+          <w:tcPr/>
+          <w:p>
+            <w:pPr>
+              <w:pStyle w:val="Compact"/>
+            </w:pPr>
+            <w:r>
+              <w:t xml:space="preserve">Precision</w:t>
+            </w:r>
+          </w:p>
+        </w:tc>
+        <w:tc>
+          <w:tcPr/>
+          <w:p>
+            <w:pPr>
+              <w:pStyle w:val="Compact"/>
+            </w:pPr>
+            <w:r>
+              <w:t xml:space="preserve">Recall</w:t>
+            </w:r>
+          </w:p>
+        </w:tc>
+        <w:tc>
+          <w:tcPr/>
+          <w:p>
+            <w:pPr>
+              <w:pStyle w:val="Compact"/>
+            </w:pPr>
+            <w:r>
+              <w:t xml:space="preserve">F1</w:t>
+            </w:r>
+          </w:p>
+        </w:tc>
+      </w:tr>
+      <w:tr>
+        <w:tc>
+          <w:tcPr/>
+          <w:p>
+            <w:pPr>
+              <w:pStyle w:val="Compact"/>
+            </w:pPr>
+            <w:r>
+              <w:t xml:space="preserve">5 percent</w:t>
+            </w:r>
+          </w:p>
+        </w:tc>
+        <w:tc>
+          <w:tcPr/>
+          <w:p>
+            <w:pPr>
+              <w:pStyle w:val="Compact"/>
+            </w:pPr>
+            <w:r>
+              <w:t xml:space="preserve">0.9615</w:t>
+            </w:r>
+          </w:p>
+        </w:tc>
+        <w:tc>
+          <w:tcPr/>
+          <w:p>
+            <w:pPr>
+              <w:pStyle w:val="Compact"/>
+            </w:pPr>
+            <w:r>
+              <w:t xml:space="preserve">1.0000</w:t>
+            </w:r>
+          </w:p>
+        </w:tc>
+        <w:tc>
+          <w:tcPr/>
+          <w:p>
+            <w:pPr>
+              <w:pStyle w:val="Compact"/>
+            </w:pPr>
+            <w:r>
+              <w:t xml:space="preserve">0.9804</w:t>
+            </w:r>
+          </w:p>
+        </w:tc>
+      </w:tr>
+      <w:tr>
+        <w:tc>
+          <w:tcPr/>
+          <w:p>
+            <w:pPr>
+              <w:pStyle w:val="Compact"/>
+            </w:pPr>
+            <w:r>
+              <w:t xml:space="preserve">10 percent</w:t>
+            </w:r>
+          </w:p>
+        </w:tc>
+        <w:tc>
+          <w:tcPr/>
+          <w:p>
+            <w:pPr>
+              <w:pStyle w:val="Compact"/>
+            </w:pPr>
+            <w:r>
+              <w:t xml:space="preserve">1.0000</w:t>
+            </w:r>
+          </w:p>
+        </w:tc>
+        <w:tc>
+          <w:tcPr/>
+          <w:p>
+            <w:pPr>
+              <w:pStyle w:val="Compact"/>
+            </w:pPr>
+            <w:r>
+              <w:t xml:space="preserve">1.0000</w:t>
+            </w:r>
+          </w:p>
+        </w:tc>
+        <w:tc>
+          <w:tcPr/>
+          <w:p>
+            <w:pPr>
+              <w:pStyle w:val="Compact"/>
+            </w:pPr>
+            <w:r>
+              <w:t xml:space="preserve">1.0000</w:t>
+            </w:r>
+          </w:p>
+        </w:tc>
+      </w:tr>
+      <w:tr>
+        <w:tc>
+          <w:tcPr/>
+          <w:p>
+            <w:pPr>
+              <w:pStyle w:val="Compact"/>
+            </w:pPr>
+            <w:r>
+              <w:t xml:space="preserve">20 percent</w:t>
+            </w:r>
+          </w:p>
+        </w:tc>
+        <w:tc>
+          <w:tcPr/>
+          <w:p>
+            <w:pPr>
+              <w:pStyle w:val="Compact"/>
+            </w:pPr>
+            <w:r>
+              <w:t xml:space="preserve">1.0000</w:t>
+            </w:r>
+          </w:p>
+        </w:tc>
+        <w:tc>
+          <w:tcPr/>
+          <w:p>
+            <w:pPr>
+              <w:pStyle w:val="Compact"/>
+            </w:pPr>
+            <w:r>
+              <w:t xml:space="preserve">1.0000</w:t>
+            </w:r>
+          </w:p>
+        </w:tc>
+        <w:tc>
+          <w:tcPr/>
+          <w:p>
+            <w:pPr>
+              <w:pStyle w:val="Compact"/>
+            </w:pPr>
+            <w:r>
+              <w:t xml:space="preserve">1.0000</w:t>
+            </w:r>
+          </w:p>
+        </w:tc>
+      </w:tr>
+      <w:tr>
+        <w:tc>
+          <w:tcPr/>
+          <w:p>
+            <w:pPr>
+              <w:pStyle w:val="Compact"/>
+            </w:pPr>
+            <w:r>
+              <w:t xml:space="preserve">30 percent</w:t>
+            </w:r>
+          </w:p>
+        </w:tc>
+        <w:tc>
+          <w:tcPr/>
+          <w:p>
+            <w:pPr>
+              <w:pStyle w:val="Compact"/>
+            </w:pPr>
+            <w:r>
+              <w:t xml:space="preserve">1.0000</w:t>
+            </w:r>
+          </w:p>
+        </w:tc>
+        <w:tc>
+          <w:tcPr/>
+          <w:p>
+            <w:pPr>
+              <w:pStyle w:val="Compact"/>
+            </w:pPr>
+            <w:r>
+              <w:t xml:space="preserve">1.0000</w:t>
+            </w:r>
+          </w:p>
+        </w:tc>
+        <w:tc>
+          <w:tcPr/>
+          <w:p>
+            <w:pPr>
+              <w:pStyle w:val="Compact"/>
+            </w:pPr>
+            <w:r>
+              <w:t xml:space="preserve">1.0000</w:t>
+            </w:r>
+          </w:p>
+        </w:tc>
+      </w:tr>
+    </w:tbl>
+    <w:p>
+      <w:pPr>
+        <w:pStyle w:val="BodyText"/>
+      </w:pPr>
+      <w:r>
+        <w:t xml:space="preserve">Recall holds at 1.00 throughout. Precision falls only at 5 percent prevalence,</w:t>
+      </w:r>
+      <w:r>
+        <w:t xml:space="preserve"> </w:t>
+      </w:r>
+      <w:r>
+        <w:t xml:space="preserve">where a single false positive among few true anomalies costs almost four points.</w:t>
+      </w:r>
+      <w:r>
+        <w:t xml:space="preserve"> </w:t>
+      </w:r>
+      <w:r>
+        <w:t xml:space="preserve">This is a property of the metric rather than of the detector, but it matters</w:t>
+      </w:r>
+      <w:r>
+        <w:t xml:space="preserve"> </w:t>
+      </w:r>
+      <w:r>
+        <w:t xml:space="preserve">operationally, because real fabrication rates are usually low and the figure</w:t>
+      </w:r>
+      <w:r>
+        <w:t xml:space="preserve"> </w:t>
+      </w:r>
+      <w:r>
+        <w:t xml:space="preserve">quantifies the review burden a deployment should expect.</w:t>
+      </w:r>
+    </w:p>
+    <w:p>
+      <w:pPr>
+        <w:pStyle w:val="BodyText"/>
+      </w:pPr>
+      <w:r>
+        <w:t xml:space="preserve">Source:</w:t>
+      </w:r>
+      <w:r>
+        <w:t xml:space="preserve"> </w:t>
+      </w:r>
+      <w:r>
+        <w:rPr>
+          <w:rStyle w:val="VerbatimChar"/>
+        </w:rPr>
+        <w:t xml:space="preserve">output/robustness_validation/metrics_sweep_r*.csv</w:t>
+      </w:r>
+      <w:r>
+        <w:t xml:space="preserve">.</w:t>
+      </w:r>
+    </w:p>
+    <w:bookmarkEnd w:id="23"/>
+    <w:bookmarkStart w:id="25" w:name="held-out-stress-evaluation"/>
+    <w:p>
+      <w:pPr>
+        <w:pStyle w:val="Heading2"/>
+      </w:pPr>
+      <w:r>
+        <w:t xml:space="preserve">5. Held-out stress evaluation</w:t>
+      </w:r>
+    </w:p>
+    <w:p>
+      <w:pPr>
+        <w:pStyle w:val="FirstParagraph"/>
+      </w:pPr>
+      <w:r>
+        <w:t xml:space="preserve">The stress generator overlaps the profiles on purpose. Some genuine respondents</w:t>
+      </w:r>
+      <w:r>
+        <w:t xml:space="preserve"> </w:t>
+      </w:r>
+      <w:r>
+        <w:t xml:space="preserve">are fast with no back navigation, and some fabricated interviews are only mildly</w:t>
+      </w:r>
+      <w:r>
+        <w:t xml:space="preserve"> </w:t>
+      </w:r>
+      <w:r>
+        <w:t xml:space="preserve">compressed. Seeds 7 and 99 were never used to develop or calibrate anything.</w:t>
+      </w:r>
+    </w:p>
+    <w:tbl>
+      <w:tblPr>
+        <w:tblStyle w:val="Table"/>
+        <w:tblW w:type="auto" w:w="0"/>
+        <w:tblLook w:firstRow="1" w:lastRow="0" w:firstColumn="0" w:lastColumn="0" w:noHBand="0" w:noVBand="0" w:val="0020"/>
+      </w:tblPr>
+      <w:tblGrid>
+        <w:gridCol w:w="1980"/>
+        <w:gridCol w:w="1980"/>
+        <w:gridCol w:w="1980"/>
+        <w:gridCol w:w="1980"/>
+      </w:tblGrid>
+      <w:tr>
+        <w:trPr>
+          <w:tblHeader w:val="on"/>
+        </w:trPr>
+        <w:tc>
+          <w:tcPr/>
+          <w:p>
+            <w:pPr>
+              <w:pStyle w:val="Compact"/>
+            </w:pPr>
+            <w:r>
+              <w:t xml:space="preserve">Dataset</w:t>
+            </w:r>
+          </w:p>
+        </w:tc>
+        <w:tc>
+          <w:tcPr/>
+          <w:p>
+            <w:pPr>
+              <w:pStyle w:val="Compact"/>
+            </w:pPr>
+            <w:r>
+              <w:t xml:space="preserve">Precision</w:t>
+            </w:r>
+          </w:p>
+        </w:tc>
+        <w:tc>
+          <w:tcPr/>
+          <w:p>
+            <w:pPr>
+              <w:pStyle w:val="Compact"/>
+            </w:pPr>
+            <w:r>
+              <w:t xml:space="preserve">Recall</w:t>
+            </w:r>
+          </w:p>
+        </w:tc>
+        <w:tc>
+          <w:tcPr/>
+          <w:p>
+            <w:pPr>
+              <w:pStyle w:val="Compact"/>
+            </w:pPr>
+            <w:r>
+              <w:t xml:space="preserve">F1</w:t>
+            </w:r>
+          </w:p>
+        </w:tc>
+      </w:tr>
+      <w:tr>
+        <w:tc>
+          <w:tcPr/>
+          <w:p>
+            <w:pPr>
+              <w:pStyle w:val="Compact"/>
+            </w:pPr>
+            <w:r>
+              <w:t xml:space="preserve">Seed 7, SurveyCTO</w:t>
+            </w:r>
+          </w:p>
+        </w:tc>
+        <w:tc>
+          <w:tcPr/>
+          <w:p>
+            <w:pPr>
+              <w:pStyle w:val="Compact"/>
+            </w:pPr>
+            <w:r>
+              <w:t xml:space="preserve">0.9770</w:t>
+            </w:r>
+          </w:p>
+        </w:tc>
+        <w:tc>
+          <w:tcPr/>
+          <w:p>
+            <w:pPr>
+              <w:pStyle w:val="Compact"/>
+            </w:pPr>
+            <w:r>
+              <w:t xml:space="preserve">0.8500</w:t>
+            </w:r>
+          </w:p>
+        </w:tc>
+        <w:tc>
+          <w:tcPr/>
+          <w:p>
+            <w:pPr>
+              <w:pStyle w:val="Compact"/>
+            </w:pPr>
+            <w:r>
+              <w:t xml:space="preserve">0.9091</w:t>
+            </w:r>
+          </w:p>
+        </w:tc>
+      </w:tr>
+      <w:tr>
+        <w:tc>
+          <w:tcPr/>
+          <w:p>
+            <w:pPr>
+              <w:pStyle w:val="Compact"/>
+            </w:pPr>
+            <w:r>
+              <w:t xml:space="preserve">Seed 7, ODK</w:t>
+            </w:r>
+          </w:p>
+        </w:tc>
+        <w:tc>
+          <w:tcPr/>
+          <w:p>
+            <w:pPr>
+              <w:pStyle w:val="Compact"/>
+            </w:pPr>
+            <w:r>
+              <w:t xml:space="preserve">0.9570</w:t>
+            </w:r>
+          </w:p>
+        </w:tc>
+        <w:tc>
+          <w:tcPr/>
+          <w:p>
+            <w:pPr>
+              <w:pStyle w:val="Compact"/>
+            </w:pPr>
+            <w:r>
+              <w:t xml:space="preserve">0.8900</w:t>
+            </w:r>
+          </w:p>
+        </w:tc>
+        <w:tc>
+          <w:tcPr/>
+          <w:p>
+            <w:pPr>
+              <w:pStyle w:val="Compact"/>
+            </w:pPr>
+            <w:r>
+              <w:t xml:space="preserve">0.9223</w:t>
+            </w:r>
+          </w:p>
+        </w:tc>
+      </w:tr>
+      <w:tr>
+        <w:tc>
+          <w:tcPr/>
+          <w:p>
+            <w:pPr>
+              <w:pStyle w:val="Compact"/>
+            </w:pPr>
+            <w:r>
+              <w:t xml:space="preserve">Seed 99, SurveyCTO</w:t>
+            </w:r>
+          </w:p>
+        </w:tc>
+        <w:tc>
+          <w:tcPr/>
+          <w:p>
+            <w:pPr>
+              <w:pStyle w:val="Compact"/>
+            </w:pPr>
+            <w:r>
+              <w:t xml:space="preserve">1.0000</w:t>
+            </w:r>
+          </w:p>
+        </w:tc>
+        <w:tc>
+          <w:tcPr/>
+          <w:p>
+            <w:pPr>
+              <w:pStyle w:val="Compact"/>
+            </w:pPr>
+            <w:r>
+              <w:t xml:space="preserve">0.8800</w:t>
+            </w:r>
+          </w:p>
+        </w:tc>
+        <w:tc>
+          <w:tcPr/>
+          <w:p>
+            <w:pPr>
+              <w:pStyle w:val="Compact"/>
+            </w:pPr>
+            <w:r>
+              <w:t xml:space="preserve">0.9362</w:t>
+            </w:r>
+          </w:p>
+        </w:tc>
+      </w:tr>
+      <w:tr>
+        <w:tc>
+          <w:tcPr/>
+          <w:p>
+            <w:pPr>
+              <w:pStyle w:val="Compact"/>
+            </w:pPr>
+            <w:r>
+              <w:t xml:space="preserve">Seed 99, ODK</w:t>
+            </w:r>
+          </w:p>
+        </w:tc>
+        <w:tc>
+          <w:tcPr/>
+          <w:p>
+            <w:pPr>
+              <w:pStyle w:val="Compact"/>
+            </w:pPr>
+            <w:r>
+              <w:t xml:space="preserve">1.0000</w:t>
+            </w:r>
+          </w:p>
+        </w:tc>
+        <w:tc>
+          <w:tcPr/>
+          <w:p>
+            <w:pPr>
+              <w:pStyle w:val="Compact"/>
+            </w:pPr>
+            <w:r>
+              <w:t xml:space="preserve">0.8400</w:t>
+            </w:r>
+          </w:p>
+        </w:tc>
+        <w:tc>
+          <w:tcPr/>
+          <w:p>
+            <w:pPr>
+              <w:pStyle w:val="Compact"/>
+            </w:pPr>
+            <w:r>
+              <w:t xml:space="preserve">0.9130</w:t>
+            </w:r>
+          </w:p>
+        </w:tc>
+      </w:tr>
+    </w:tbl>
+    <w:p>
+      <w:pPr>
+        <w:pStyle w:val="BodyText"/>
+      </w:pPr>
+      <w:r>
+        <w:t xml:space="preserve">All four runs clear both success criteria, and performance is consistent across</w:t>
+      </w:r>
+      <w:r>
+        <w:t xml:space="preserve"> </w:t>
+      </w:r>
+      <w:r>
+        <w:t xml:space="preserve">the two platform formats. That consistency is itself a result: the same detector,</w:t>
+      </w:r>
+      <w:r>
+        <w:t xml:space="preserve"> </w:t>
+      </w:r>
+      <w:r>
+        <w:t xml:space="preserve">unmodified, performs equivalently on structurally different inputs, which is what</w:t>
+      </w:r>
+      <w:r>
+        <w:t xml:space="preserve"> </w:t>
+      </w:r>
+      <w:r>
+        <w:t xml:space="preserve">the common intermediate representation was designed to achieve.</w:t>
+      </w:r>
+    </w:p>
+    <w:p>
+      <w:pPr>
+        <w:pStyle w:val="BodyText"/>
+      </w:pPr>
+      <w:r>
+        <w:t xml:space="preserve">Per-class recall by anomaly type, all four runs. Each cell is the count of that</w:t>
+      </w:r>
+      <w:r>
+        <w:t xml:space="preserve"> </w:t>
+      </w:r>
+      <w:r>
+        <w:t xml:space="preserve">injected class the detector flagged, over the count present:</w:t>
+      </w:r>
+    </w:p>
+    <w:tbl>
+      <w:tblPr>
+        <w:tblStyle w:val="Table"/>
+        <w:tblW w:type="pct" w:w="5000"/>
+        <w:tblLayout w:type="fixed"/>
+        <w:tblLook w:firstRow="1" w:lastRow="0" w:firstColumn="0" w:lastColumn="0" w:noHBand="0" w:noVBand="0" w:val="0020"/>
+      </w:tblPr>
+      <w:tblGrid>
+        <w:gridCol w:w="1980"/>
+        <w:gridCol w:w="1980"/>
+        <w:gridCol w:w="1980"/>
+        <w:gridCol w:w="1980"/>
+      </w:tblGrid>
+      <w:tr>
+        <w:trPr>
+          <w:tblHeader w:val="on"/>
+        </w:trPr>
+        <w:tc>
+          <w:tcPr/>
+          <w:p>
+            <w:pPr>
+              <w:pStyle w:val="Compact"/>
+            </w:pPr>
+            <w:r>
+              <w:t xml:space="preserve">Run</w:t>
+            </w:r>
+          </w:p>
+        </w:tc>
+        <w:tc>
+          <w:tcPr/>
+          <w:p>
+            <w:pPr>
+              <w:pStyle w:val="Compact"/>
+            </w:pPr>
+            <w:r>
               <w:t xml:space="preserve">Speeding</w:t>
             </w:r>
           </w:p>
@@ -4544,7 +5820,7 @@
         </w:tc>
       </w:tr>
     </w:tbl>
-    <w:bookmarkStart w:id="22" w:name="what-the-misses-are"/>
+    <w:bookmarkStart w:id="24" w:name="what-the-misses-are"/>
     <w:p>
       <w:pPr>
         <w:pStyle w:val="Heading3"/>
@@ -4795,9 +6071,9 @@
         <w:t xml:space="preserve">.</w:t>
       </w:r>
     </w:p>
-    <w:bookmarkEnd w:id="22"/>
-    <w:bookmarkEnd w:id="23"/>
-    <w:bookmarkStart w:id="24" w:name="earlier-stress-sweep-seeds-11-and-42"/>
+    <w:bookmarkEnd w:id="24"/>
+    <w:bookmarkEnd w:id="25"/>
+    <w:bookmarkStart w:id="26" w:name="earlier-stress-sweep-seeds-11-and-42"/>
     <w:p>
       <w:pPr>
         <w:pStyle w:val="Heading2"/>
@@ -4961,8 +6237,8 @@
         <w:t xml:space="preserve">.</w:t>
       </w:r>
     </w:p>
-    <w:bookmarkEnd w:id="24"/>
-    <w:bookmarkStart w:id="25" w:name="larger-benchmark-packs-and-scale"/>
+    <w:bookmarkEnd w:id="26"/>
+    <w:bookmarkStart w:id="27" w:name="larger-benchmark-packs-and-scale"/>
     <w:p>
       <w:pPr>
         <w:pStyle w:val="Heading2"/>
@@ -5208,8 +6484,8 @@
         <w:t xml:space="preserve">.</w:t>
       </w:r>
     </w:p>
-    <w:bookmarkEnd w:id="25"/>
-    <w:bookmarkStart w:id="26" w:name="production-readiness-sweep"/>
+    <w:bookmarkEnd w:id="27"/>
+    <w:bookmarkStart w:id="28" w:name="production-readiness-sweep"/>
     <w:p>
       <w:pPr>
         <w:pStyle w:val="Heading2"/>
@@ -5317,8 +6593,8 @@
         <w:t xml:space="preserve">.</w:t>
       </w:r>
     </w:p>
-    <w:bookmarkEnd w:id="26"/>
-    <w:bookmarkStart w:id="27" w:name="reproducibility"/>
+    <w:bookmarkEnd w:id="28"/>
+    <w:bookmarkStart w:id="29" w:name="reproducibility"/>
     <w:p>
       <w:pPr>
         <w:pStyle w:val="Heading2"/>
@@ -5470,8 +6746,8 @@
         <w:t xml:space="preserve"> pytest</w:t>
       </w:r>
     </w:p>
-    <w:bookmarkEnd w:id="27"/>
-    <w:bookmarkEnd w:id="28"/>
+    <w:bookmarkEnd w:id="29"/>
+    <w:bookmarkEnd w:id="30"/>
     <w:sectPr>
       <w:footerReference r:id="rId7" w:type="default"/>
       <w:pgSz w:h="16838" w:orient="portrait" w:w="11906"/>
@@ -5695,6 +6971,109 @@
       </w:pPr>
     </w:lvl>
   </w:abstractNum>
+  <w:abstractNum w:abstractNumId="991">
+    <w:nsid w:val="0000A991"/>
+    <w:multiLevelType w:val="multilevel"/>
+    <w:lvl w:ilvl="0">
+      <w:numFmt w:val="bullet"/>
+      <w:lvlText w:val=""/>
+      <w:lvlJc w:val="left"/>
+      <w:pPr>
+        <w:ind w:left="720" w:hanging="360"/>
+      </w:pPr>
+      <w:rPr>
+        <w:rFonts w:ascii="Symbol" w:hAnsi="Symbol" w:cs="Symbol" w:hint="default"/>
+      </w:rPr>
+    </w:lvl>
+    <w:lvl w:ilvl="1">
+      <w:numFmt w:val="bullet"/>
+      <w:lvlText w:val="o"/>
+      <w:lvlJc w:val="left"/>
+      <w:pPr>
+        <w:ind w:left="1440" w:hanging="360"/>
+      </w:pPr>
+      <w:rPr>
+        <w:rFonts w:ascii="Courier New" w:hAnsi="Courier New" w:cs="Courier New" w:hint="default"/>
+      </w:rPr>
+    </w:lvl>
+    <w:lvl w:ilvl="2">
+      <w:numFmt w:val="bullet"/>
+      <w:lvlText w:val=""/>
+      <w:lvlJc w:val="left"/>
+      <w:pPr>
+        <w:ind w:left="2160" w:hanging="360"/>
+      </w:pPr>
+      <w:rPr>
+        <w:rFonts w:ascii="Wingdings" w:hAnsi="Wingdings" w:cs="Wingdings" w:hint="default"/>
+      </w:rPr>
+    </w:lvl>
+    <w:lvl w:ilvl="3">
+      <w:numFmt w:val="bullet"/>
+      <w:lvlText w:val=""/>
+      <w:lvlJc w:val="left"/>
+      <w:pPr>
+        <w:ind w:left="2880" w:hanging="360"/>
+      </w:pPr>
+      <w:rPr>
+        <w:rFonts w:ascii="Symbol" w:hAnsi="Symbol" w:cs="Symbol" w:hint="default"/>
+      </w:rPr>
+    </w:lvl>
+    <w:lvl w:ilvl="4">
+      <w:numFmt w:val="bullet"/>
+      <w:lvlText w:val="o"/>
+      <w:lvlJc w:val="left"/>
+      <w:pPr>
+        <w:ind w:left="3600" w:hanging="360"/>
+      </w:pPr>
+      <w:rPr>
+        <w:rFonts w:ascii="Courier New" w:hAnsi="Courier New" w:cs="Courier New" w:hint="default"/>
+      </w:rPr>
+    </w:lvl>
+    <w:lvl w:ilvl="5">
+      <w:numFmt w:val="bullet"/>
+      <w:lvlText w:val=""/>
+      <w:lvlJc w:val="left"/>
+      <w:pPr>
+        <w:ind w:left="4320" w:hanging="360"/>
+      </w:pPr>
+      <w:rPr>
+        <w:rFonts w:ascii="Wingdings" w:hAnsi="Wingdings" w:cs="Wingdings" w:hint="default"/>
+      </w:rPr>
+    </w:lvl>
+    <w:lvl w:ilvl="6">
+      <w:numFmt w:val="bullet"/>
+      <w:lvlText w:val=""/>
+      <w:lvlJc w:val="left"/>
+      <w:pPr>
+        <w:ind w:left="5040" w:hanging="360"/>
+      </w:pPr>
+      <w:rPr>
+        <w:rFonts w:ascii="Symbol" w:hAnsi="Symbol" w:cs="Symbol" w:hint="default"/>
+      </w:rPr>
+    </w:lvl>
+    <w:lvl w:ilvl="7">
+      <w:numFmt w:val="bullet"/>
+      <w:lvlText w:val="o"/>
+      <w:lvlJc w:val="left"/>
+      <w:pPr>
+        <w:ind w:left="5760" w:hanging="360"/>
+      </w:pPr>
+      <w:rPr>
+        <w:rFonts w:ascii="Courier New" w:hAnsi="Courier New" w:cs="Courier New" w:hint="default"/>
+      </w:rPr>
+    </w:lvl>
+    <w:lvl w:ilvl="8">
+      <w:numFmt w:val="bullet"/>
+      <w:lvlText w:val=""/>
+      <w:lvlJc w:val="left"/>
+      <w:pPr>
+        <w:ind w:left="6480" w:hanging="360"/>
+      </w:pPr>
+      <w:rPr>
+        <w:rFonts w:ascii="Wingdings" w:hAnsi="Wingdings" w:cs="Wingdings" w:hint="default"/>
+      </w:rPr>
+    </w:lvl>
+  </w:abstractNum>
   <w:num w:numId="1">
     <w:abstractNumId w:val="1"/>
     <w:lvlOverride w:ilvl="0">
@@ -5703,6 +7082,9 @@
   </w:num>
   <w:num w:numId="1000">
     <w:abstractNumId w:val="990"/>
+  </w:num>
+  <w:num w:numId="1001">
+    <w:abstractNumId w:val="991"/>
   </w:num>
 </w:numbering>
 </file>
@@ -5907,6 +7289,240 @@
       <w:sz w:val="20"/>
       <w:szCs w:val="20"/>
     </w:rPr>
+  </w:style>
+  <w:style w:customStyle="1" w:styleId="SourceCode" w:type="paragraph">
+    <w:name w:val="Source Code"/>
+    <w:basedOn w:val="Normal"/>
+    <w:link w:val="VerbatimChar"/>
+    <w:pPr>
+      <w:wordWrap w:val="off"/>
+    </w:pPr>
+  </w:style>
+  <w:style w:customStyle="1" w:styleId="KeywordTok" w:type="character">
+    <w:name w:val="KeywordTok"/>
+    <w:basedOn w:val="VerbatimChar"/>
+    <w:rPr>
+      <w:b/>
+      <w:color w:val="007020"/>
+    </w:rPr>
+  </w:style>
+  <w:style w:customStyle="1" w:styleId="DataTypeTok" w:type="character">
+    <w:name w:val="DataTypeTok"/>
+    <w:basedOn w:val="VerbatimChar"/>
+    <w:rPr>
+      <w:color w:val="902000"/>
+    </w:rPr>
+  </w:style>
+  <w:style w:customStyle="1" w:styleId="DecValTok" w:type="character">
+    <w:name w:val="DecValTok"/>
+    <w:basedOn w:val="VerbatimChar"/>
+    <w:rPr>
+      <w:color w:val="40a070"/>
+    </w:rPr>
+  </w:style>
+  <w:style w:customStyle="1" w:styleId="BaseNTok" w:type="character">
+    <w:name w:val="BaseNTok"/>
+    <w:basedOn w:val="VerbatimChar"/>
+    <w:rPr>
+      <w:color w:val="40a070"/>
+    </w:rPr>
+  </w:style>
+  <w:style w:customStyle="1" w:styleId="FloatTok" w:type="character">
+    <w:name w:val="FloatTok"/>
+    <w:basedOn w:val="VerbatimChar"/>
+    <w:rPr>
+      <w:color w:val="40a070"/>
+    </w:rPr>
+  </w:style>
+  <w:style w:customStyle="1" w:styleId="ConstantTok" w:type="character">
+    <w:name w:val="ConstantTok"/>
+    <w:basedOn w:val="VerbatimChar"/>
+    <w:rPr>
+      <w:color w:val="880000"/>
+    </w:rPr>
+  </w:style>
+  <w:style w:customStyle="1" w:styleId="CharTok" w:type="character">
+    <w:name w:val="CharTok"/>
+    <w:basedOn w:val="VerbatimChar"/>
+    <w:rPr>
+      <w:color w:val="4070a0"/>
+    </w:rPr>
+  </w:style>
+  <w:style w:customStyle="1" w:styleId="SpecialCharTok" w:type="character">
+    <w:name w:val="SpecialCharTok"/>
+    <w:basedOn w:val="VerbatimChar"/>
+    <w:rPr>
+      <w:color w:val="4070a0"/>
+    </w:rPr>
+  </w:style>
+  <w:style w:customStyle="1" w:styleId="StringTok" w:type="character">
+    <w:name w:val="StringTok"/>
+    <w:basedOn w:val="VerbatimChar"/>
+    <w:rPr>
+      <w:color w:val="4070a0"/>
+    </w:rPr>
+  </w:style>
+  <w:style w:customStyle="1" w:styleId="VerbatimStringTok" w:type="character">
+    <w:name w:val="VerbatimStringTok"/>
+    <w:basedOn w:val="VerbatimChar"/>
+    <w:rPr>
+      <w:color w:val="4070a0"/>
+    </w:rPr>
+  </w:style>
+  <w:style w:customStyle="1" w:styleId="SpecialStringTok" w:type="character">
+    <w:name w:val="SpecialStringTok"/>
+    <w:basedOn w:val="VerbatimChar"/>
+    <w:rPr>
+      <w:color w:val="bb6688"/>
+    </w:rPr>
+  </w:style>
+  <w:style w:customStyle="1" w:styleId="ImportTok" w:type="character">
+    <w:name w:val="ImportTok"/>
+    <w:basedOn w:val="VerbatimChar"/>
+    <w:rPr>
+      <w:b/>
+      <w:color w:val="008000"/>
+    </w:rPr>
+  </w:style>
+  <w:style w:customStyle="1" w:styleId="CommentTok" w:type="character">
+    <w:name w:val="CommentTok"/>
+    <w:basedOn w:val="VerbatimChar"/>
+    <w:rPr>
+      <w:i/>
+      <w:color w:val="60a0b0"/>
+    </w:rPr>
+  </w:style>
+  <w:style w:customStyle="1" w:styleId="DocumentationTok" w:type="character">
+    <w:name w:val="DocumentationTok"/>
+    <w:basedOn w:val="VerbatimChar"/>
+    <w:rPr>
+      <w:i/>
+      <w:color w:val="ba2121"/>
+    </w:rPr>
+  </w:style>
+  <w:style w:customStyle="1" w:styleId="AnnotationTok" w:type="character">
+    <w:name w:val="AnnotationTok"/>
+    <w:basedOn w:val="VerbatimChar"/>
+    <w:rPr>
+      <w:b/>
+      <w:i/>
+      <w:color w:val="60a0b0"/>
+    </w:rPr>
+  </w:style>
+  <w:style w:customStyle="1" w:styleId="CommentVarTok" w:type="character">
+    <w:name w:val="CommentVarTok"/>
+    <w:basedOn w:val="VerbatimChar"/>
+    <w:rPr>
+      <w:b/>
+      <w:i/>
+      <w:color w:val="60a0b0"/>
+    </w:rPr>
+  </w:style>
+  <w:style w:customStyle="1" w:styleId="OtherTok" w:type="character">
+    <w:name w:val="OtherTok"/>
+    <w:basedOn w:val="VerbatimChar"/>
+    <w:rPr>
+      <w:color w:val="007020"/>
+    </w:rPr>
+  </w:style>
+  <w:style w:customStyle="1" w:styleId="FunctionTok" w:type="character">
+    <w:name w:val="FunctionTok"/>
+    <w:basedOn w:val="VerbatimChar"/>
+    <w:rPr>
+      <w:color w:val="06287e"/>
+    </w:rPr>
+  </w:style>
+  <w:style w:customStyle="1" w:styleId="VariableTok" w:type="character">
+    <w:name w:val="VariableTok"/>
+    <w:basedOn w:val="VerbatimChar"/>
+    <w:rPr>
+      <w:color w:val="19177c"/>
+    </w:rPr>
+  </w:style>
+  <w:style w:customStyle="1" w:styleId="ControlFlowTok" w:type="character">
+    <w:name w:val="ControlFlowTok"/>
+    <w:basedOn w:val="VerbatimChar"/>
+    <w:rPr>
+      <w:b/>
+      <w:color w:val="007020"/>
+    </w:rPr>
+  </w:style>
+  <w:style w:customStyle="1" w:styleId="OperatorTok" w:type="character">
+    <w:name w:val="OperatorTok"/>
+    <w:basedOn w:val="VerbatimChar"/>
+    <w:rPr>
+      <w:color w:val="666666"/>
+    </w:rPr>
+  </w:style>
+  <w:style w:customStyle="1" w:styleId="BuiltInTok" w:type="character">
+    <w:name w:val="BuiltInTok"/>
+    <w:basedOn w:val="VerbatimChar"/>
+    <w:rPr>
+      <w:color w:val="008000"/>
+    </w:rPr>
+  </w:style>
+  <w:style w:customStyle="1" w:styleId="ExtensionTok" w:type="character">
+    <w:name w:val="ExtensionTok"/>
+    <w:basedOn w:val="VerbatimChar"/>
+    <w:rPr/>
+  </w:style>
+  <w:style w:customStyle="1" w:styleId="PreprocessorTok" w:type="character">
+    <w:name w:val="PreprocessorTok"/>
+    <w:basedOn w:val="VerbatimChar"/>
+    <w:rPr>
+      <w:color w:val="bc7a00"/>
+    </w:rPr>
+  </w:style>
+  <w:style w:customStyle="1" w:styleId="AttributeTok" w:type="character">
+    <w:name w:val="AttributeTok"/>
+    <w:basedOn w:val="VerbatimChar"/>
+    <w:rPr>
+      <w:color w:val="7d9029"/>
+    </w:rPr>
+  </w:style>
+  <w:style w:customStyle="1" w:styleId="RegionMarkerTok" w:type="character">
+    <w:name w:val="RegionMarkerTok"/>
+    <w:basedOn w:val="VerbatimChar"/>
+    <w:rPr/>
+  </w:style>
+  <w:style w:customStyle="1" w:styleId="InformationTok" w:type="character">
+    <w:name w:val="InformationTok"/>
+    <w:basedOn w:val="VerbatimChar"/>
+    <w:rPr>
+      <w:b/>
+      <w:i/>
+      <w:color w:val="60a0b0"/>
+    </w:rPr>
+  </w:style>
+  <w:style w:customStyle="1" w:styleId="WarningTok" w:type="character">
+    <w:name w:val="WarningTok"/>
+    <w:basedOn w:val="VerbatimChar"/>
+    <w:rPr>
+      <w:b/>
+      <w:i/>
+      <w:color w:val="60a0b0"/>
+    </w:rPr>
+  </w:style>
+  <w:style w:customStyle="1" w:styleId="AlertTok" w:type="character">
+    <w:name w:val="AlertTok"/>
+    <w:basedOn w:val="VerbatimChar"/>
+    <w:rPr>
+      <w:b/>
+      <w:color w:val="ff0000"/>
+    </w:rPr>
+  </w:style>
+  <w:style w:customStyle="1" w:styleId="ErrorTok" w:type="character">
+    <w:name w:val="ErrorTok"/>
+    <w:basedOn w:val="VerbatimChar"/>
+    <w:rPr>
+      <w:b/>
+      <w:color w:val="ff0000"/>
+    </w:rPr>
+  </w:style>
+  <w:style w:customStyle="1" w:styleId="NormalTok" w:type="character">
+    <w:name w:val="NormalTok"/>
+    <w:basedOn w:val="VerbatimChar"/>
+    <w:rPr/>
   </w:style>
   <w:style w:customStyle="1" w:styleId="SourceCode" w:type="paragraph">
     <w:name w:val="Source Code"/>

</xml_diff>